<commit_message>
Finalize revised UML model, official v4 evidence and verified submission reports
</commit_message>
<xml_diff>
--- a/deliverables/final-submission/Cloudrest_Wines_Verification_Report.docx
+++ b/deliverables/final-submission/Cloudrest_Wines_Verification_Report.docx
@@ -41,7 +41,7 @@
           <w:color w:val="1B5E20"/>
           <w:sz w:val="26"/>
         </w:rPr>
-        <w:t>PASS — 64/64 checks passed</w:t>
+        <w:t>PASS — 73/73 checks passed</w:t>
       </w:r>
     </w:p>
     <w:p>
@@ -80,6 +80,7 @@
       <w:tr>
         <w:trPr>
           <w:tblHeader w:val="true"/>
+          <w:cantSplit/>
         </w:trPr>
         <w:tc>
           <w:tcPr>
@@ -95,6 +96,7 @@
           </w:tcPr>
           <w:p>
             <w:pPr>
+              <w:keepNext/>
               <w:jc w:val="center"/>
             </w:pPr>
             <w:r>
@@ -122,6 +124,7 @@
           </w:tcPr>
           <w:p>
             <w:pPr>
+              <w:keepNext/>
               <w:jc w:val="center"/>
             </w:pPr>
             <w:r>
@@ -137,6 +140,9 @@
         </w:tc>
       </w:tr>
       <w:tr>
+        <w:trPr>
+          <w:cantSplit/>
+        </w:trPr>
         <w:tc>
           <w:tcPr>
             <w:tcW w:type="dxa" w:w="2400"/>
@@ -150,6 +156,7 @@
           </w:tcPr>
           <w:p>
             <w:pPr>
+              <w:keepNext/>
               <w:spacing w:after="0"/>
             </w:pPr>
             <w:r>
@@ -174,6 +181,7 @@
           </w:tcPr>
           <w:p>
             <w:pPr>
+              <w:keepNext/>
               <w:spacing w:after="0"/>
             </w:pPr>
             <w:r>
@@ -181,12 +189,15 @@
                 <w:rFonts w:ascii="Times New Roman" w:hAnsi="Times New Roman"/>
                 <w:sz w:val="20"/>
               </w:rPr>
-              <w:t>2026-08-16T23:18:32</w:t>
+              <w:t>2026-10-07T20:43:51</w:t>
             </w:r>
           </w:p>
         </w:tc>
       </w:tr>
       <w:tr>
+        <w:trPr>
+          <w:cantSplit/>
+        </w:trPr>
         <w:tc>
           <w:tcPr>
             <w:tcW w:type="dxa" w:w="2400"/>
@@ -200,6 +211,7 @@
           </w:tcPr>
           <w:p>
             <w:pPr>
+              <w:keepNext/>
               <w:spacing w:after="0"/>
             </w:pPr>
             <w:r>
@@ -224,6 +236,7 @@
           </w:tcPr>
           <w:p>
             <w:pPr>
+              <w:keepNext/>
               <w:spacing w:after="0"/>
             </w:pPr>
             <w:r>
@@ -237,6 +250,9 @@
         </w:tc>
       </w:tr>
       <w:tr>
+        <w:trPr>
+          <w:cantSplit/>
+        </w:trPr>
         <w:tc>
           <w:tcPr>
             <w:tcW w:type="dxa" w:w="2400"/>
@@ -250,6 +266,7 @@
           </w:tcPr>
           <w:p>
             <w:pPr>
+              <w:keepNext/>
               <w:spacing w:after="0"/>
             </w:pPr>
             <w:r>
@@ -274,6 +291,7 @@
           </w:tcPr>
           <w:p>
             <w:pPr>
+              <w:keepNext/>
               <w:spacing w:after="0"/>
             </w:pPr>
             <w:r>
@@ -287,6 +305,9 @@
         </w:tc>
       </w:tr>
       <w:tr>
+        <w:trPr>
+          <w:cantSplit/>
+        </w:trPr>
         <w:tc>
           <w:tcPr>
             <w:tcW w:type="dxa" w:w="2400"/>
@@ -300,6 +321,7 @@
           </w:tcPr>
           <w:p>
             <w:pPr>
+              <w:keepNext w:val="0"/>
               <w:spacing w:after="0"/>
             </w:pPr>
             <w:r>
@@ -324,6 +346,7 @@
           </w:tcPr>
           <w:p>
             <w:pPr>
+              <w:keepNext w:val="0"/>
               <w:spacing w:after="0"/>
             </w:pPr>
             <w:r>
@@ -366,6 +389,7 @@
       <w:tr>
         <w:trPr>
           <w:tblHeader w:val="true"/>
+          <w:cantSplit/>
         </w:trPr>
         <w:tc>
           <w:tcPr>
@@ -381,6 +405,7 @@
           </w:tcPr>
           <w:p>
             <w:pPr>
+              <w:keepNext/>
               <w:jc w:val="center"/>
             </w:pPr>
             <w:r>
@@ -408,6 +433,7 @@
           </w:tcPr>
           <w:p>
             <w:pPr>
+              <w:keepNext/>
               <w:jc w:val="center"/>
             </w:pPr>
             <w:r>
@@ -435,6 +461,7 @@
           </w:tcPr>
           <w:p>
             <w:pPr>
+              <w:keepNext/>
               <w:jc w:val="center"/>
             </w:pPr>
             <w:r>
@@ -450,6 +477,9 @@
         </w:tc>
       </w:tr>
       <w:tr>
+        <w:trPr>
+          <w:cantSplit/>
+        </w:trPr>
         <w:tc>
           <w:tcPr>
             <w:tcW w:type="dxa" w:w="900"/>
@@ -463,6 +493,7 @@
           </w:tcPr>
           <w:p>
             <w:pPr>
+              <w:keepNext w:val="0"/>
               <w:spacing w:after="0"/>
             </w:pPr>
             <w:r>
@@ -487,6 +518,7 @@
           </w:tcPr>
           <w:p>
             <w:pPr>
+              <w:keepNext w:val="0"/>
               <w:spacing w:after="0"/>
             </w:pPr>
             <w:r>
@@ -511,6 +543,7 @@
           </w:tcPr>
           <w:p>
             <w:pPr>
+              <w:keepNext w:val="0"/>
               <w:spacing w:after="0"/>
             </w:pPr>
             <w:r>
@@ -524,6 +557,9 @@
         </w:tc>
       </w:tr>
       <w:tr>
+        <w:trPr>
+          <w:cantSplit/>
+        </w:trPr>
         <w:tc>
           <w:tcPr>
             <w:tcW w:type="dxa" w:w="900"/>
@@ -537,6 +573,7 @@
           </w:tcPr>
           <w:p>
             <w:pPr>
+              <w:keepNext w:val="0"/>
               <w:spacing w:after="0"/>
             </w:pPr>
             <w:r>
@@ -561,6 +598,7 @@
           </w:tcPr>
           <w:p>
             <w:pPr>
+              <w:keepNext w:val="0"/>
               <w:spacing w:after="0"/>
             </w:pPr>
             <w:r>
@@ -585,6 +623,7 @@
           </w:tcPr>
           <w:p>
             <w:pPr>
+              <w:keepNext w:val="0"/>
               <w:spacing w:after="0"/>
             </w:pPr>
             <w:r>
@@ -592,12 +631,15 @@
                 <w:rFonts w:ascii="Times New Roman" w:hAnsi="Times New Roman"/>
                 <w:sz w:val="17"/>
               </w:rPr>
-              <w:t>{'baseTables': 55, 'views': 1, 'columns': 282, 'foreignKeys': 72, 'checkConstraints': 48, 'triggers': 15, 'routines': 1}</w:t>
+              <w:t>{'baseTables': 55, 'views': 1, 'columns': 286, 'foreignKeys': 72, 'checkConstraints': 50, 'triggers': 30, 'routines': 3}</w:t>
             </w:r>
           </w:p>
         </w:tc>
       </w:tr>
       <w:tr>
+        <w:trPr>
+          <w:cantSplit/>
+        </w:trPr>
         <w:tc>
           <w:tcPr>
             <w:tcW w:type="dxa" w:w="900"/>
@@ -611,6 +653,7 @@
           </w:tcPr>
           <w:p>
             <w:pPr>
+              <w:keepNext w:val="0"/>
               <w:spacing w:after="0"/>
             </w:pPr>
             <w:r>
@@ -635,6 +678,7 @@
           </w:tcPr>
           <w:p>
             <w:pPr>
+              <w:keepNext w:val="0"/>
               <w:spacing w:after="0"/>
             </w:pPr>
             <w:r>
@@ -659,6 +703,7 @@
           </w:tcPr>
           <w:p>
             <w:pPr>
+              <w:keepNext w:val="0"/>
               <w:spacing w:after="0"/>
             </w:pPr>
             <w:r>
@@ -672,6 +717,9 @@
         </w:tc>
       </w:tr>
       <w:tr>
+        <w:trPr>
+          <w:cantSplit/>
+        </w:trPr>
         <w:tc>
           <w:tcPr>
             <w:tcW w:type="dxa" w:w="900"/>
@@ -685,6 +733,7 @@
           </w:tcPr>
           <w:p>
             <w:pPr>
+              <w:keepNext w:val="0"/>
               <w:spacing w:after="0"/>
             </w:pPr>
             <w:r>
@@ -709,6 +758,7 @@
           </w:tcPr>
           <w:p>
             <w:pPr>
+              <w:keepNext w:val="0"/>
               <w:spacing w:after="0"/>
             </w:pPr>
             <w:r>
@@ -733,6 +783,7 @@
           </w:tcPr>
           <w:p>
             <w:pPr>
+              <w:keepNext w:val="0"/>
               <w:spacing w:after="0"/>
             </w:pPr>
             <w:r>
@@ -746,6 +797,9 @@
         </w:tc>
       </w:tr>
       <w:tr>
+        <w:trPr>
+          <w:cantSplit/>
+        </w:trPr>
         <w:tc>
           <w:tcPr>
             <w:tcW w:type="dxa" w:w="900"/>
@@ -759,6 +813,7 @@
           </w:tcPr>
           <w:p>
             <w:pPr>
+              <w:keepNext w:val="0"/>
               <w:spacing w:after="0"/>
             </w:pPr>
             <w:r>
@@ -783,6 +838,7 @@
           </w:tcPr>
           <w:p>
             <w:pPr>
+              <w:keepNext w:val="0"/>
               <w:spacing w:after="0"/>
             </w:pPr>
             <w:r>
@@ -807,6 +863,7 @@
           </w:tcPr>
           <w:p>
             <w:pPr>
+              <w:keepNext w:val="0"/>
               <w:spacing w:after="0"/>
             </w:pPr>
             <w:r>
@@ -820,6 +877,9 @@
         </w:tc>
       </w:tr>
       <w:tr>
+        <w:trPr>
+          <w:cantSplit/>
+        </w:trPr>
         <w:tc>
           <w:tcPr>
             <w:tcW w:type="dxa" w:w="900"/>
@@ -833,6 +893,7 @@
           </w:tcPr>
           <w:p>
             <w:pPr>
+              <w:keepNext w:val="0"/>
               <w:spacing w:after="0"/>
             </w:pPr>
             <w:r>
@@ -857,6 +918,7 @@
           </w:tcPr>
           <w:p>
             <w:pPr>
+              <w:keepNext w:val="0"/>
               <w:spacing w:after="0"/>
             </w:pPr>
             <w:r>
@@ -881,6 +943,7 @@
           </w:tcPr>
           <w:p>
             <w:pPr>
+              <w:keepNext w:val="0"/>
               <w:spacing w:after="0"/>
             </w:pPr>
             <w:r>
@@ -894,6 +957,9 @@
         </w:tc>
       </w:tr>
       <w:tr>
+        <w:trPr>
+          <w:cantSplit/>
+        </w:trPr>
         <w:tc>
           <w:tcPr>
             <w:tcW w:type="dxa" w:w="900"/>
@@ -907,6 +973,7 @@
           </w:tcPr>
           <w:p>
             <w:pPr>
+              <w:keepNext w:val="0"/>
               <w:spacing w:after="0"/>
             </w:pPr>
             <w:r>
@@ -931,6 +998,7 @@
           </w:tcPr>
           <w:p>
             <w:pPr>
+              <w:keepNext w:val="0"/>
               <w:spacing w:after="0"/>
             </w:pPr>
             <w:r>
@@ -955,6 +1023,7 @@
           </w:tcPr>
           <w:p>
             <w:pPr>
+              <w:keepNext w:val="0"/>
               <w:spacing w:after="0"/>
             </w:pPr>
             <w:r>
@@ -968,6 +1037,9 @@
         </w:tc>
       </w:tr>
       <w:tr>
+        <w:trPr>
+          <w:cantSplit/>
+        </w:trPr>
         <w:tc>
           <w:tcPr>
             <w:tcW w:type="dxa" w:w="900"/>
@@ -981,6 +1053,7 @@
           </w:tcPr>
           <w:p>
             <w:pPr>
+              <w:keepNext w:val="0"/>
               <w:spacing w:after="0"/>
             </w:pPr>
             <w:r>
@@ -1005,6 +1078,7 @@
           </w:tcPr>
           <w:p>
             <w:pPr>
+              <w:keepNext w:val="0"/>
               <w:spacing w:after="0"/>
             </w:pPr>
             <w:r>
@@ -1029,6 +1103,7 @@
           </w:tcPr>
           <w:p>
             <w:pPr>
+              <w:keepNext w:val="0"/>
               <w:spacing w:after="0"/>
             </w:pPr>
             <w:r>
@@ -1042,6 +1117,9 @@
         </w:tc>
       </w:tr>
       <w:tr>
+        <w:trPr>
+          <w:cantSplit/>
+        </w:trPr>
         <w:tc>
           <w:tcPr>
             <w:tcW w:type="dxa" w:w="900"/>
@@ -1055,6 +1133,7 @@
           </w:tcPr>
           <w:p>
             <w:pPr>
+              <w:keepNext w:val="0"/>
               <w:spacing w:after="0"/>
             </w:pPr>
             <w:r>
@@ -1079,6 +1158,7 @@
           </w:tcPr>
           <w:p>
             <w:pPr>
+              <w:keepNext w:val="0"/>
               <w:spacing w:after="0"/>
             </w:pPr>
             <w:r>
@@ -1103,6 +1183,7 @@
           </w:tcPr>
           <w:p>
             <w:pPr>
+              <w:keepNext w:val="0"/>
               <w:spacing w:after="0"/>
             </w:pPr>
             <w:r>
@@ -1116,6 +1197,9 @@
         </w:tc>
       </w:tr>
       <w:tr>
+        <w:trPr>
+          <w:cantSplit/>
+        </w:trPr>
         <w:tc>
           <w:tcPr>
             <w:tcW w:type="dxa" w:w="900"/>
@@ -1129,6 +1213,7 @@
           </w:tcPr>
           <w:p>
             <w:pPr>
+              <w:keepNext w:val="0"/>
               <w:spacing w:after="0"/>
             </w:pPr>
             <w:r>
@@ -1153,6 +1238,7 @@
           </w:tcPr>
           <w:p>
             <w:pPr>
+              <w:keepNext w:val="0"/>
               <w:spacing w:after="0"/>
             </w:pPr>
             <w:r>
@@ -1177,6 +1263,7 @@
           </w:tcPr>
           <w:p>
             <w:pPr>
+              <w:keepNext w:val="0"/>
               <w:spacing w:after="0"/>
             </w:pPr>
             <w:r>
@@ -1190,6 +1277,9 @@
         </w:tc>
       </w:tr>
       <w:tr>
+        <w:trPr>
+          <w:cantSplit/>
+        </w:trPr>
         <w:tc>
           <w:tcPr>
             <w:tcW w:type="dxa" w:w="900"/>
@@ -1203,6 +1293,7 @@
           </w:tcPr>
           <w:p>
             <w:pPr>
+              <w:keepNext w:val="0"/>
               <w:spacing w:after="0"/>
             </w:pPr>
             <w:r>
@@ -1227,6 +1318,7 @@
           </w:tcPr>
           <w:p>
             <w:pPr>
+              <w:keepNext w:val="0"/>
               <w:spacing w:after="0"/>
             </w:pPr>
             <w:r>
@@ -1251,6 +1343,7 @@
           </w:tcPr>
           <w:p>
             <w:pPr>
+              <w:keepNext w:val="0"/>
               <w:spacing w:after="0"/>
             </w:pPr>
             <w:r>
@@ -1264,6 +1357,9 @@
         </w:tc>
       </w:tr>
       <w:tr>
+        <w:trPr>
+          <w:cantSplit/>
+        </w:trPr>
         <w:tc>
           <w:tcPr>
             <w:tcW w:type="dxa" w:w="900"/>
@@ -1277,6 +1373,7 @@
           </w:tcPr>
           <w:p>
             <w:pPr>
+              <w:keepNext w:val="0"/>
               <w:spacing w:after="0"/>
             </w:pPr>
             <w:r>
@@ -1301,6 +1398,7 @@
           </w:tcPr>
           <w:p>
             <w:pPr>
+              <w:keepNext w:val="0"/>
               <w:spacing w:after="0"/>
             </w:pPr>
             <w:r>
@@ -1325,6 +1423,7 @@
           </w:tcPr>
           <w:p>
             <w:pPr>
+              <w:keepNext w:val="0"/>
               <w:spacing w:after="0"/>
             </w:pPr>
             <w:r>
@@ -1338,6 +1437,9 @@
         </w:tc>
       </w:tr>
       <w:tr>
+        <w:trPr>
+          <w:cantSplit/>
+        </w:trPr>
         <w:tc>
           <w:tcPr>
             <w:tcW w:type="dxa" w:w="900"/>
@@ -1351,6 +1453,7 @@
           </w:tcPr>
           <w:p>
             <w:pPr>
+              <w:keepNext w:val="0"/>
               <w:spacing w:after="0"/>
             </w:pPr>
             <w:r>
@@ -1375,6 +1478,7 @@
           </w:tcPr>
           <w:p>
             <w:pPr>
+              <w:keepNext w:val="0"/>
               <w:spacing w:after="0"/>
             </w:pPr>
             <w:r>
@@ -1399,6 +1503,7 @@
           </w:tcPr>
           <w:p>
             <w:pPr>
+              <w:keepNext w:val="0"/>
               <w:spacing w:after="0"/>
             </w:pPr>
             <w:r>
@@ -1412,6 +1517,9 @@
         </w:tc>
       </w:tr>
       <w:tr>
+        <w:trPr>
+          <w:cantSplit/>
+        </w:trPr>
         <w:tc>
           <w:tcPr>
             <w:tcW w:type="dxa" w:w="900"/>
@@ -1425,6 +1533,7 @@
           </w:tcPr>
           <w:p>
             <w:pPr>
+              <w:keepNext w:val="0"/>
               <w:spacing w:after="0"/>
             </w:pPr>
             <w:r>
@@ -1449,6 +1558,7 @@
           </w:tcPr>
           <w:p>
             <w:pPr>
+              <w:keepNext w:val="0"/>
               <w:spacing w:after="0"/>
             </w:pPr>
             <w:r>
@@ -1473,6 +1583,7 @@
           </w:tcPr>
           <w:p>
             <w:pPr>
+              <w:keepNext w:val="0"/>
               <w:spacing w:after="0"/>
             </w:pPr>
             <w:r>
@@ -1486,6 +1597,9 @@
         </w:tc>
       </w:tr>
       <w:tr>
+        <w:trPr>
+          <w:cantSplit/>
+        </w:trPr>
         <w:tc>
           <w:tcPr>
             <w:tcW w:type="dxa" w:w="900"/>
@@ -1499,6 +1613,7 @@
           </w:tcPr>
           <w:p>
             <w:pPr>
+              <w:keepNext w:val="0"/>
               <w:spacing w:after="0"/>
             </w:pPr>
             <w:r>
@@ -1523,6 +1638,7 @@
           </w:tcPr>
           <w:p>
             <w:pPr>
+              <w:keepNext w:val="0"/>
               <w:spacing w:after="0"/>
             </w:pPr>
             <w:r>
@@ -1547,6 +1663,7 @@
           </w:tcPr>
           <w:p>
             <w:pPr>
+              <w:keepNext w:val="0"/>
               <w:spacing w:after="0"/>
             </w:pPr>
             <w:r>
@@ -1560,6 +1677,9 @@
         </w:tc>
       </w:tr>
       <w:tr>
+        <w:trPr>
+          <w:cantSplit/>
+        </w:trPr>
         <w:tc>
           <w:tcPr>
             <w:tcW w:type="dxa" w:w="900"/>
@@ -1573,6 +1693,7 @@
           </w:tcPr>
           <w:p>
             <w:pPr>
+              <w:keepNext w:val="0"/>
               <w:spacing w:after="0"/>
             </w:pPr>
             <w:r>
@@ -1597,6 +1718,7 @@
           </w:tcPr>
           <w:p>
             <w:pPr>
+              <w:keepNext w:val="0"/>
               <w:spacing w:after="0"/>
             </w:pPr>
             <w:r>
@@ -1621,6 +1743,7 @@
           </w:tcPr>
           <w:p>
             <w:pPr>
+              <w:keepNext w:val="0"/>
               <w:spacing w:after="0"/>
             </w:pPr>
             <w:r>
@@ -1634,6 +1757,9 @@
         </w:tc>
       </w:tr>
       <w:tr>
+        <w:trPr>
+          <w:cantSplit/>
+        </w:trPr>
         <w:tc>
           <w:tcPr>
             <w:tcW w:type="dxa" w:w="900"/>
@@ -1647,6 +1773,7 @@
           </w:tcPr>
           <w:p>
             <w:pPr>
+              <w:keepNext w:val="0"/>
               <w:spacing w:after="0"/>
             </w:pPr>
             <w:r>
@@ -1671,6 +1798,7 @@
           </w:tcPr>
           <w:p>
             <w:pPr>
+              <w:keepNext w:val="0"/>
               <w:spacing w:after="0"/>
             </w:pPr>
             <w:r>
@@ -1695,6 +1823,7 @@
           </w:tcPr>
           <w:p>
             <w:pPr>
+              <w:keepNext w:val="0"/>
               <w:spacing w:after="0"/>
             </w:pPr>
             <w:r>
@@ -1708,6 +1837,9 @@
         </w:tc>
       </w:tr>
       <w:tr>
+        <w:trPr>
+          <w:cantSplit/>
+        </w:trPr>
         <w:tc>
           <w:tcPr>
             <w:tcW w:type="dxa" w:w="900"/>
@@ -1721,6 +1853,7 @@
           </w:tcPr>
           <w:p>
             <w:pPr>
+              <w:keepNext w:val="0"/>
               <w:spacing w:after="0"/>
             </w:pPr>
             <w:r>
@@ -1745,6 +1878,7 @@
           </w:tcPr>
           <w:p>
             <w:pPr>
+              <w:keepNext w:val="0"/>
               <w:spacing w:after="0"/>
             </w:pPr>
             <w:r>
@@ -1769,6 +1903,7 @@
           </w:tcPr>
           <w:p>
             <w:pPr>
+              <w:keepNext w:val="0"/>
               <w:spacing w:after="0"/>
             </w:pPr>
             <w:r>
@@ -1782,6 +1917,9 @@
         </w:tc>
       </w:tr>
       <w:tr>
+        <w:trPr>
+          <w:cantSplit/>
+        </w:trPr>
         <w:tc>
           <w:tcPr>
             <w:tcW w:type="dxa" w:w="900"/>
@@ -1795,6 +1933,7 @@
           </w:tcPr>
           <w:p>
             <w:pPr>
+              <w:keepNext w:val="0"/>
               <w:spacing w:after="0"/>
             </w:pPr>
             <w:r>
@@ -1819,6 +1958,7 @@
           </w:tcPr>
           <w:p>
             <w:pPr>
+              <w:keepNext w:val="0"/>
               <w:spacing w:after="0"/>
             </w:pPr>
             <w:r>
@@ -1843,6 +1983,7 @@
           </w:tcPr>
           <w:p>
             <w:pPr>
+              <w:keepNext w:val="0"/>
               <w:spacing w:after="0"/>
             </w:pPr>
             <w:r>
@@ -1856,6 +1997,9 @@
         </w:tc>
       </w:tr>
       <w:tr>
+        <w:trPr>
+          <w:cantSplit/>
+        </w:trPr>
         <w:tc>
           <w:tcPr>
             <w:tcW w:type="dxa" w:w="900"/>
@@ -1869,6 +2013,7 @@
           </w:tcPr>
           <w:p>
             <w:pPr>
+              <w:keepNext w:val="0"/>
               <w:spacing w:after="0"/>
             </w:pPr>
             <w:r>
@@ -1893,6 +2038,7 @@
           </w:tcPr>
           <w:p>
             <w:pPr>
+              <w:keepNext w:val="0"/>
               <w:spacing w:after="0"/>
             </w:pPr>
             <w:r>
@@ -1917,6 +2063,7 @@
           </w:tcPr>
           <w:p>
             <w:pPr>
+              <w:keepNext w:val="0"/>
               <w:spacing w:after="0"/>
             </w:pPr>
             <w:r>
@@ -1930,6 +2077,9 @@
         </w:tc>
       </w:tr>
       <w:tr>
+        <w:trPr>
+          <w:cantSplit/>
+        </w:trPr>
         <w:tc>
           <w:tcPr>
             <w:tcW w:type="dxa" w:w="900"/>
@@ -1943,6 +2093,7 @@
           </w:tcPr>
           <w:p>
             <w:pPr>
+              <w:keepNext w:val="0"/>
               <w:spacing w:after="0"/>
             </w:pPr>
             <w:r>
@@ -1967,6 +2118,7 @@
           </w:tcPr>
           <w:p>
             <w:pPr>
+              <w:keepNext w:val="0"/>
               <w:spacing w:after="0"/>
             </w:pPr>
             <w:r>
@@ -1991,6 +2143,7 @@
           </w:tcPr>
           <w:p>
             <w:pPr>
+              <w:keepNext w:val="0"/>
               <w:spacing w:after="0"/>
             </w:pPr>
             <w:r>
@@ -2004,6 +2157,9 @@
         </w:tc>
       </w:tr>
       <w:tr>
+        <w:trPr>
+          <w:cantSplit/>
+        </w:trPr>
         <w:tc>
           <w:tcPr>
             <w:tcW w:type="dxa" w:w="900"/>
@@ -2017,6 +2173,7 @@
           </w:tcPr>
           <w:p>
             <w:pPr>
+              <w:keepNext w:val="0"/>
               <w:spacing w:after="0"/>
             </w:pPr>
             <w:r>
@@ -2041,6 +2198,247 @@
           </w:tcPr>
           <w:p>
             <w:pPr>
+              <w:keepNext w:val="0"/>
+              <w:spacing w:after="0"/>
+            </w:pPr>
+            <w:r>
+              <w:rPr>
+                <w:rFonts w:ascii="Times New Roman" w:hAnsi="Times New Roman"/>
+                <w:sz w:val="17"/>
+              </w:rPr>
+              <w:t>Vineyard supports multiple varieties in one vintage</w:t>
+            </w:r>
+          </w:p>
+        </w:tc>
+        <w:tc>
+          <w:tcPr>
+            <w:tcW w:type="dxa" w:w="5060"/>
+            <w:vAlign w:val="center"/>
+            <w:tcMar>
+              <w:top w:w="80" w:type="dxa"/>
+              <w:start w:w="100" w:type="dxa"/>
+              <w:bottom w:w="80" w:type="dxa"/>
+              <w:end w:w="100" w:type="dxa"/>
+            </w:tcMar>
+          </w:tcPr>
+          <w:p>
+            <w:pPr>
+              <w:keepNext w:val="0"/>
+              <w:spacing w:after="0"/>
+            </w:pPr>
+            <w:r>
+              <w:rPr>
+                <w:rFonts w:ascii="Times New Roman" w:hAnsi="Times New Roman"/>
+                <w:sz w:val="17"/>
+              </w:rPr>
+              <w:t>violations=0</w:t>
+            </w:r>
+          </w:p>
+        </w:tc>
+      </w:tr>
+      <w:tr>
+        <w:trPr>
+          <w:cantSplit/>
+        </w:trPr>
+        <w:tc>
+          <w:tcPr>
+            <w:tcW w:type="dxa" w:w="900"/>
+            <w:vAlign w:val="center"/>
+            <w:tcMar>
+              <w:top w:w="80" w:type="dxa"/>
+              <w:start w:w="100" w:type="dxa"/>
+              <w:bottom w:w="80" w:type="dxa"/>
+              <w:end w:w="100" w:type="dxa"/>
+            </w:tcMar>
+          </w:tcPr>
+          <w:p>
+            <w:pPr>
+              <w:keepNext w:val="0"/>
+              <w:spacing w:after="0"/>
+            </w:pPr>
+            <w:r>
+              <w:rPr>
+                <w:rFonts w:ascii="Times New Roman" w:hAnsi="Times New Roman"/>
+                <w:sz w:val="17"/>
+              </w:rPr>
+              <w:t>PASS</w:t>
+            </w:r>
+          </w:p>
+        </w:tc>
+        <w:tc>
+          <w:tcPr>
+            <w:tcW w:type="dxa" w:w="3400"/>
+            <w:vAlign w:val="center"/>
+            <w:tcMar>
+              <w:top w:w="80" w:type="dxa"/>
+              <w:start w:w="100" w:type="dxa"/>
+              <w:bottom w:w="80" w:type="dxa"/>
+              <w:end w:w="100" w:type="dxa"/>
+            </w:tcMar>
+          </w:tcPr>
+          <w:p>
+            <w:pPr>
+              <w:keepNext w:val="0"/>
+              <w:spacing w:after="0"/>
+            </w:pPr>
+            <w:r>
+              <w:rPr>
+                <w:rFonts w:ascii="Times New Roman" w:hAnsi="Times New Roman"/>
+                <w:sz w:val="17"/>
+              </w:rPr>
+              <w:t>All test-data wine compositions total 100</w:t>
+            </w:r>
+          </w:p>
+        </w:tc>
+        <w:tc>
+          <w:tcPr>
+            <w:tcW w:type="dxa" w:w="5060"/>
+            <w:vAlign w:val="center"/>
+            <w:tcMar>
+              <w:top w:w="80" w:type="dxa"/>
+              <w:start w:w="100" w:type="dxa"/>
+              <w:bottom w:w="80" w:type="dxa"/>
+              <w:end w:w="100" w:type="dxa"/>
+            </w:tcMar>
+          </w:tcPr>
+          <w:p>
+            <w:pPr>
+              <w:keepNext w:val="0"/>
+              <w:spacing w:after="0"/>
+            </w:pPr>
+            <w:r>
+              <w:rPr>
+                <w:rFonts w:ascii="Times New Roman" w:hAnsi="Times New Roman"/>
+                <w:sz w:val="17"/>
+              </w:rPr>
+              <w:t>violations=0</w:t>
+            </w:r>
+          </w:p>
+        </w:tc>
+      </w:tr>
+      <w:tr>
+        <w:trPr>
+          <w:cantSplit/>
+        </w:trPr>
+        <w:tc>
+          <w:tcPr>
+            <w:tcW w:type="dxa" w:w="900"/>
+            <w:vAlign w:val="center"/>
+            <w:tcMar>
+              <w:top w:w="80" w:type="dxa"/>
+              <w:start w:w="100" w:type="dxa"/>
+              <w:bottom w:w="80" w:type="dxa"/>
+              <w:end w:w="100" w:type="dxa"/>
+            </w:tcMar>
+          </w:tcPr>
+          <w:p>
+            <w:pPr>
+              <w:keepNext w:val="0"/>
+              <w:spacing w:after="0"/>
+            </w:pPr>
+            <w:r>
+              <w:rPr>
+                <w:rFonts w:ascii="Times New Roman" w:hAnsi="Times New Roman"/>
+                <w:sz w:val="17"/>
+              </w:rPr>
+              <w:t>PASS</w:t>
+            </w:r>
+          </w:p>
+        </w:tc>
+        <w:tc>
+          <w:tcPr>
+            <w:tcW w:type="dxa" w:w="3400"/>
+            <w:vAlign w:val="center"/>
+            <w:tcMar>
+              <w:top w:w="80" w:type="dxa"/>
+              <w:start w:w="100" w:type="dxa"/>
+              <w:bottom w:w="80" w:type="dxa"/>
+              <w:end w:w="100" w:type="dxa"/>
+            </w:tcMar>
+          </w:tcPr>
+          <w:p>
+            <w:pPr>
+              <w:keepNext w:val="0"/>
+              <w:spacing w:after="0"/>
+            </w:pPr>
+            <w:r>
+              <w:rPr>
+                <w:rFonts w:ascii="Times New Roman" w:hAnsi="Times New Roman"/>
+                <w:sz w:val="17"/>
+              </w:rPr>
+              <w:t>No duplicate current customer address purpose</w:t>
+            </w:r>
+          </w:p>
+        </w:tc>
+        <w:tc>
+          <w:tcPr>
+            <w:tcW w:type="dxa" w:w="5060"/>
+            <w:vAlign w:val="center"/>
+            <w:tcMar>
+              <w:top w:w="80" w:type="dxa"/>
+              <w:start w:w="100" w:type="dxa"/>
+              <w:bottom w:w="80" w:type="dxa"/>
+              <w:end w:w="100" w:type="dxa"/>
+            </w:tcMar>
+          </w:tcPr>
+          <w:p>
+            <w:pPr>
+              <w:keepNext w:val="0"/>
+              <w:spacing w:after="0"/>
+            </w:pPr>
+            <w:r>
+              <w:rPr>
+                <w:rFonts w:ascii="Times New Roman" w:hAnsi="Times New Roman"/>
+                <w:sz w:val="17"/>
+              </w:rPr>
+              <w:t>violations=0</w:t>
+            </w:r>
+          </w:p>
+        </w:tc>
+      </w:tr>
+      <w:tr>
+        <w:trPr>
+          <w:cantSplit/>
+        </w:trPr>
+        <w:tc>
+          <w:tcPr>
+            <w:tcW w:type="dxa" w:w="900"/>
+            <w:vAlign w:val="center"/>
+            <w:tcMar>
+              <w:top w:w="80" w:type="dxa"/>
+              <w:start w:w="100" w:type="dxa"/>
+              <w:bottom w:w="80" w:type="dxa"/>
+              <w:end w:w="100" w:type="dxa"/>
+            </w:tcMar>
+          </w:tcPr>
+          <w:p>
+            <w:pPr>
+              <w:keepNext w:val="0"/>
+              <w:spacing w:after="0"/>
+            </w:pPr>
+            <w:r>
+              <w:rPr>
+                <w:rFonts w:ascii="Times New Roman" w:hAnsi="Times New Roman"/>
+                <w:sz w:val="17"/>
+              </w:rPr>
+              <w:t>PASS</w:t>
+            </w:r>
+          </w:p>
+        </w:tc>
+        <w:tc>
+          <w:tcPr>
+            <w:tcW w:type="dxa" w:w="3400"/>
+            <w:vAlign w:val="center"/>
+            <w:tcMar>
+              <w:top w:w="80" w:type="dxa"/>
+              <w:start w:w="100" w:type="dxa"/>
+              <w:bottom w:w="80" w:type="dxa"/>
+              <w:end w:w="100" w:type="dxa"/>
+            </w:tcMar>
+          </w:tcPr>
+          <w:p>
+            <w:pPr>
+              <w:keepNext w:val="0"/>
               <w:spacing w:after="0"/>
             </w:pPr>
             <w:r>
@@ -2065,6 +2463,7 @@
           </w:tcPr>
           <w:p>
             <w:pPr>
+              <w:keepNext w:val="0"/>
               <w:spacing w:after="0"/>
             </w:pPr>
             <w:r>
@@ -2078,6 +2477,9 @@
         </w:tc>
       </w:tr>
       <w:tr>
+        <w:trPr>
+          <w:cantSplit/>
+        </w:trPr>
         <w:tc>
           <w:tcPr>
             <w:tcW w:type="dxa" w:w="900"/>
@@ -2091,6 +2493,7 @@
           </w:tcPr>
           <w:p>
             <w:pPr>
+              <w:keepNext w:val="0"/>
               <w:spacing w:after="0"/>
             </w:pPr>
             <w:r>
@@ -2115,6 +2518,7 @@
           </w:tcPr>
           <w:p>
             <w:pPr>
+              <w:keepNext w:val="0"/>
               <w:spacing w:after="0"/>
             </w:pPr>
             <w:r>
@@ -2139,6 +2543,7 @@
           </w:tcPr>
           <w:p>
             <w:pPr>
+              <w:keepNext w:val="0"/>
               <w:spacing w:after="0"/>
             </w:pPr>
             <w:r>
@@ -2152,6 +2557,9 @@
         </w:tc>
       </w:tr>
       <w:tr>
+        <w:trPr>
+          <w:cantSplit/>
+        </w:trPr>
         <w:tc>
           <w:tcPr>
             <w:tcW w:type="dxa" w:w="900"/>
@@ -2165,6 +2573,7 @@
           </w:tcPr>
           <w:p>
             <w:pPr>
+              <w:keepNext w:val="0"/>
               <w:spacing w:after="0"/>
             </w:pPr>
             <w:r>
@@ -2189,6 +2598,7 @@
           </w:tcPr>
           <w:p>
             <w:pPr>
+              <w:keepNext w:val="0"/>
               <w:spacing w:after="0"/>
             </w:pPr>
             <w:r>
@@ -2213,6 +2623,7 @@
           </w:tcPr>
           <w:p>
             <w:pPr>
+              <w:keepNext w:val="0"/>
               <w:spacing w:after="0"/>
             </w:pPr>
             <w:r>
@@ -2220,12 +2631,15 @@
                 <w:rFonts w:ascii="Times New Roman" w:hAnsi="Times New Roman"/>
                 <w:sz w:val="17"/>
               </w:rPr>
-              <w:t xml:space="preserve">exit=0, chars=239, </w:t>
+              <w:t xml:space="preserve">exit=0, chars=273, </w:t>
             </w:r>
           </w:p>
         </w:tc>
       </w:tr>
       <w:tr>
+        <w:trPr>
+          <w:cantSplit/>
+        </w:trPr>
         <w:tc>
           <w:tcPr>
             <w:tcW w:type="dxa" w:w="900"/>
@@ -2239,6 +2653,7 @@
           </w:tcPr>
           <w:p>
             <w:pPr>
+              <w:keepNext w:val="0"/>
               <w:spacing w:after="0"/>
             </w:pPr>
             <w:r>
@@ -2263,6 +2678,7 @@
           </w:tcPr>
           <w:p>
             <w:pPr>
+              <w:keepNext w:val="0"/>
               <w:spacing w:after="0"/>
             </w:pPr>
             <w:r>
@@ -2287,6 +2703,7 @@
           </w:tcPr>
           <w:p>
             <w:pPr>
+              <w:keepNext w:val="0"/>
               <w:spacing w:after="0"/>
             </w:pPr>
             <w:r>
@@ -2294,12 +2711,15 @@
                 <w:rFonts w:ascii="Times New Roman" w:hAnsi="Times New Roman"/>
                 <w:sz w:val="17"/>
               </w:rPr>
-              <w:t xml:space="preserve">exit=0, chars=422, </w:t>
+              <w:t xml:space="preserve">exit=0, chars=1117, </w:t>
             </w:r>
           </w:p>
         </w:tc>
       </w:tr>
       <w:tr>
+        <w:trPr>
+          <w:cantSplit/>
+        </w:trPr>
         <w:tc>
           <w:tcPr>
             <w:tcW w:type="dxa" w:w="900"/>
@@ -2313,6 +2733,7 @@
           </w:tcPr>
           <w:p>
             <w:pPr>
+              <w:keepNext w:val="0"/>
               <w:spacing w:after="0"/>
             </w:pPr>
             <w:r>
@@ -2337,6 +2758,7 @@
           </w:tcPr>
           <w:p>
             <w:pPr>
+              <w:keepNext w:val="0"/>
               <w:spacing w:after="0"/>
             </w:pPr>
             <w:r>
@@ -2361,6 +2783,7 @@
           </w:tcPr>
           <w:p>
             <w:pPr>
+              <w:keepNext w:val="0"/>
               <w:spacing w:after="0"/>
             </w:pPr>
             <w:r>
@@ -2374,6 +2797,9 @@
         </w:tc>
       </w:tr>
       <w:tr>
+        <w:trPr>
+          <w:cantSplit/>
+        </w:trPr>
         <w:tc>
           <w:tcPr>
             <w:tcW w:type="dxa" w:w="900"/>
@@ -2387,6 +2813,7 @@
           </w:tcPr>
           <w:p>
             <w:pPr>
+              <w:keepNext w:val="0"/>
               <w:spacing w:after="0"/>
             </w:pPr>
             <w:r>
@@ -2411,6 +2838,7 @@
           </w:tcPr>
           <w:p>
             <w:pPr>
+              <w:keepNext w:val="0"/>
               <w:spacing w:after="0"/>
             </w:pPr>
             <w:r>
@@ -2435,6 +2863,7 @@
           </w:tcPr>
           <w:p>
             <w:pPr>
+              <w:keepNext w:val="0"/>
               <w:spacing w:after="0"/>
             </w:pPr>
             <w:r>
@@ -2448,6 +2877,9 @@
         </w:tc>
       </w:tr>
       <w:tr>
+        <w:trPr>
+          <w:cantSplit/>
+        </w:trPr>
         <w:tc>
           <w:tcPr>
             <w:tcW w:type="dxa" w:w="900"/>
@@ -2461,6 +2893,7 @@
           </w:tcPr>
           <w:p>
             <w:pPr>
+              <w:keepNext w:val="0"/>
               <w:spacing w:after="0"/>
             </w:pPr>
             <w:r>
@@ -2485,6 +2918,7 @@
           </w:tcPr>
           <w:p>
             <w:pPr>
+              <w:keepNext w:val="0"/>
               <w:spacing w:after="0"/>
             </w:pPr>
             <w:r>
@@ -2509,6 +2943,7 @@
           </w:tcPr>
           <w:p>
             <w:pPr>
+              <w:keepNext w:val="0"/>
               <w:spacing w:after="0"/>
             </w:pPr>
             <w:r>
@@ -2524,6 +2959,9 @@
         </w:tc>
       </w:tr>
       <w:tr>
+        <w:trPr>
+          <w:cantSplit/>
+        </w:trPr>
         <w:tc>
           <w:tcPr>
             <w:tcW w:type="dxa" w:w="900"/>
@@ -2537,6 +2975,7 @@
           </w:tcPr>
           <w:p>
             <w:pPr>
+              <w:keepNext w:val="0"/>
               <w:spacing w:after="0"/>
             </w:pPr>
             <w:r>
@@ -2561,6 +3000,7 @@
           </w:tcPr>
           <w:p>
             <w:pPr>
+              <w:keepNext w:val="0"/>
               <w:spacing w:after="0"/>
             </w:pPr>
             <w:r>
@@ -2585,6 +3025,7 @@
           </w:tcPr>
           <w:p>
             <w:pPr>
+              <w:keepNext w:val="0"/>
               <w:spacing w:after="0"/>
             </w:pPr>
             <w:r>
@@ -2598,6 +3039,9 @@
         </w:tc>
       </w:tr>
       <w:tr>
+        <w:trPr>
+          <w:cantSplit/>
+        </w:trPr>
         <w:tc>
           <w:tcPr>
             <w:tcW w:type="dxa" w:w="900"/>
@@ -2611,6 +3055,7 @@
           </w:tcPr>
           <w:p>
             <w:pPr>
+              <w:keepNext w:val="0"/>
               <w:spacing w:after="0"/>
             </w:pPr>
             <w:r>
@@ -2635,6 +3080,7 @@
           </w:tcPr>
           <w:p>
             <w:pPr>
+              <w:keepNext w:val="0"/>
               <w:spacing w:after="0"/>
             </w:pPr>
             <w:r>
@@ -2659,6 +3105,7 @@
           </w:tcPr>
           <w:p>
             <w:pPr>
+              <w:keepNext w:val="0"/>
               <w:spacing w:after="0"/>
             </w:pPr>
             <w:r>
@@ -2672,6 +3119,9 @@
         </w:tc>
       </w:tr>
       <w:tr>
+        <w:trPr>
+          <w:cantSplit/>
+        </w:trPr>
         <w:tc>
           <w:tcPr>
             <w:tcW w:type="dxa" w:w="900"/>
@@ -2685,6 +3135,7 @@
           </w:tcPr>
           <w:p>
             <w:pPr>
+              <w:keepNext w:val="0"/>
               <w:spacing w:after="0"/>
             </w:pPr>
             <w:r>
@@ -2709,6 +3160,7 @@
           </w:tcPr>
           <w:p>
             <w:pPr>
+              <w:keepNext w:val="0"/>
               <w:spacing w:after="0"/>
             </w:pPr>
             <w:r>
@@ -2733,6 +3185,7 @@
           </w:tcPr>
           <w:p>
             <w:pPr>
+              <w:keepNext w:val="0"/>
               <w:spacing w:after="0"/>
             </w:pPr>
             <w:r>
@@ -2746,6 +3199,9 @@
         </w:tc>
       </w:tr>
       <w:tr>
+        <w:trPr>
+          <w:cantSplit/>
+        </w:trPr>
         <w:tc>
           <w:tcPr>
             <w:tcW w:type="dxa" w:w="900"/>
@@ -2759,6 +3215,7 @@
           </w:tcPr>
           <w:p>
             <w:pPr>
+              <w:keepNext w:val="0"/>
               <w:spacing w:after="0"/>
             </w:pPr>
             <w:r>
@@ -2783,6 +3240,7 @@
           </w:tcPr>
           <w:p>
             <w:pPr>
+              <w:keepNext w:val="0"/>
               <w:spacing w:after="0"/>
             </w:pPr>
             <w:r>
@@ -2807,6 +3265,7 @@
           </w:tcPr>
           <w:p>
             <w:pPr>
+              <w:keepNext w:val="0"/>
               <w:spacing w:after="0"/>
             </w:pPr>
             <w:r>
@@ -2820,6 +3279,9 @@
         </w:tc>
       </w:tr>
       <w:tr>
+        <w:trPr>
+          <w:cantSplit/>
+        </w:trPr>
         <w:tc>
           <w:tcPr>
             <w:tcW w:type="dxa" w:w="900"/>
@@ -2833,6 +3295,7 @@
           </w:tcPr>
           <w:p>
             <w:pPr>
+              <w:keepNext w:val="0"/>
               <w:spacing w:after="0"/>
             </w:pPr>
             <w:r>
@@ -2857,6 +3320,489 @@
           </w:tcPr>
           <w:p>
             <w:pPr>
+              <w:keepNext w:val="0"/>
+              <w:spacing w:after="0"/>
+            </w:pPr>
+            <w:r>
+              <w:rPr>
+                <w:rFonts w:ascii="Times New Roman" w:hAnsi="Times New Roman"/>
+                <w:sz w:val="17"/>
+              </w:rPr>
+              <w:t>Assessed integrity test: t06_pack_rejoin.sql</w:t>
+            </w:r>
+          </w:p>
+        </w:tc>
+        <w:tc>
+          <w:tcPr>
+            <w:tcW w:type="dxa" w:w="5060"/>
+            <w:vAlign w:val="center"/>
+            <w:tcMar>
+              <w:top w:w="80" w:type="dxa"/>
+              <w:start w:w="100" w:type="dxa"/>
+              <w:bottom w:w="80" w:type="dxa"/>
+              <w:end w:w="100" w:type="dxa"/>
+            </w:tcMar>
+          </w:tcPr>
+          <w:p>
+            <w:pPr>
+              <w:keepNext w:val="0"/>
+              <w:spacing w:after="0"/>
+            </w:pPr>
+            <w:r>
+              <w:rPr>
+                <w:rFonts w:ascii="Times New Roman" w:hAnsi="Times New Roman"/>
+                <w:sz w:val="17"/>
+              </w:rPr>
+              <w:t>exit=0; expected=PASS: picker can rejoin; testResult</w:t>
+              <w:br/>
+              <w:t>PASS: picker can rejoin the same pack after leaving</w:t>
+            </w:r>
+          </w:p>
+        </w:tc>
+      </w:tr>
+      <w:tr>
+        <w:trPr>
+          <w:cantSplit/>
+        </w:trPr>
+        <w:tc>
+          <w:tcPr>
+            <w:tcW w:type="dxa" w:w="900"/>
+            <w:vAlign w:val="center"/>
+            <w:tcMar>
+              <w:top w:w="80" w:type="dxa"/>
+              <w:start w:w="100" w:type="dxa"/>
+              <w:bottom w:w="80" w:type="dxa"/>
+              <w:end w:w="100" w:type="dxa"/>
+            </w:tcMar>
+          </w:tcPr>
+          <w:p>
+            <w:pPr>
+              <w:keepNext w:val="0"/>
+              <w:spacing w:after="0"/>
+            </w:pPr>
+            <w:r>
+              <w:rPr>
+                <w:rFonts w:ascii="Times New Roman" w:hAnsi="Times New Roman"/>
+                <w:sz w:val="17"/>
+              </w:rPr>
+              <w:t>PASS</w:t>
+            </w:r>
+          </w:p>
+        </w:tc>
+        <w:tc>
+          <w:tcPr>
+            <w:tcW w:type="dxa" w:w="3400"/>
+            <w:vAlign w:val="center"/>
+            <w:tcMar>
+              <w:top w:w="80" w:type="dxa"/>
+              <w:start w:w="100" w:type="dxa"/>
+              <w:bottom w:w="80" w:type="dxa"/>
+              <w:end w:w="100" w:type="dxa"/>
+            </w:tcMar>
+          </w:tcPr>
+          <w:p>
+            <w:pPr>
+              <w:keepNext w:val="0"/>
+              <w:spacing w:after="0"/>
+            </w:pPr>
+            <w:r>
+              <w:rPr>
+                <w:rFonts w:ascii="Times New Roman" w:hAnsi="Times New Roman"/>
+                <w:sz w:val="17"/>
+              </w:rPr>
+              <w:t>Assessed integrity test: t07_employee_current_address_overlap.sql</w:t>
+            </w:r>
+          </w:p>
+        </w:tc>
+        <w:tc>
+          <w:tcPr>
+            <w:tcW w:type="dxa" w:w="5060"/>
+            <w:vAlign w:val="center"/>
+            <w:tcMar>
+              <w:top w:w="80" w:type="dxa"/>
+              <w:start w:w="100" w:type="dxa"/>
+              <w:bottom w:w="80" w:type="dxa"/>
+              <w:end w:w="100" w:type="dxa"/>
+            </w:tcMar>
+          </w:tcPr>
+          <w:p>
+            <w:pPr>
+              <w:keepNext w:val="0"/>
+              <w:spacing w:after="0"/>
+            </w:pPr>
+            <w:r>
+              <w:rPr>
+                <w:rFonts w:ascii="Times New Roman" w:hAnsi="Times New Roman"/>
+                <w:sz w:val="17"/>
+              </w:rPr>
+              <w:t>exit=1; expected=Employee address period overlaps; ERROR 1644 (45000) at line 3: Employee address period overlaps an existing address of the same kind</w:t>
+            </w:r>
+          </w:p>
+        </w:tc>
+      </w:tr>
+      <w:tr>
+        <w:trPr>
+          <w:cantSplit/>
+        </w:trPr>
+        <w:tc>
+          <w:tcPr>
+            <w:tcW w:type="dxa" w:w="900"/>
+            <w:vAlign w:val="center"/>
+            <w:tcMar>
+              <w:top w:w="80" w:type="dxa"/>
+              <w:start w:w="100" w:type="dxa"/>
+              <w:bottom w:w="80" w:type="dxa"/>
+              <w:end w:w="100" w:type="dxa"/>
+            </w:tcMar>
+          </w:tcPr>
+          <w:p>
+            <w:pPr>
+              <w:keepNext w:val="0"/>
+              <w:spacing w:after="0"/>
+            </w:pPr>
+            <w:r>
+              <w:rPr>
+                <w:rFonts w:ascii="Times New Roman" w:hAnsi="Times New Roman"/>
+                <w:sz w:val="17"/>
+              </w:rPr>
+              <w:t>PASS</w:t>
+            </w:r>
+          </w:p>
+        </w:tc>
+        <w:tc>
+          <w:tcPr>
+            <w:tcW w:type="dxa" w:w="3400"/>
+            <w:vAlign w:val="center"/>
+            <w:tcMar>
+              <w:top w:w="80" w:type="dxa"/>
+              <w:start w:w="100" w:type="dxa"/>
+              <w:bottom w:w="80" w:type="dxa"/>
+              <w:end w:w="100" w:type="dxa"/>
+            </w:tcMar>
+          </w:tcPr>
+          <w:p>
+            <w:pPr>
+              <w:keepNext w:val="0"/>
+              <w:spacing w:after="0"/>
+            </w:pPr>
+            <w:r>
+              <w:rPr>
+                <w:rFonts w:ascii="Times New Roman" w:hAnsi="Times New Roman"/>
+                <w:sz w:val="17"/>
+              </w:rPr>
+              <w:t>Assessed integrity test: t08_customer_primary_phone_overlap.sql</w:t>
+            </w:r>
+          </w:p>
+        </w:tc>
+        <w:tc>
+          <w:tcPr>
+            <w:tcW w:type="dxa" w:w="5060"/>
+            <w:vAlign w:val="center"/>
+            <w:tcMar>
+              <w:top w:w="80" w:type="dxa"/>
+              <w:start w:w="100" w:type="dxa"/>
+              <w:bottom w:w="80" w:type="dxa"/>
+              <w:end w:w="100" w:type="dxa"/>
+            </w:tcMar>
+          </w:tcPr>
+          <w:p>
+            <w:pPr>
+              <w:keepNext w:val="0"/>
+              <w:spacing w:after="0"/>
+            </w:pPr>
+            <w:r>
+              <w:rPr>
+                <w:rFonts w:ascii="Times New Roman" w:hAnsi="Times New Roman"/>
+                <w:sz w:val="17"/>
+              </w:rPr>
+              <w:t>exit=1; expected=Customer may have only one current primary phone; ERROR 1644 (45000) at line 3: Customer may have only one current primary phone</w:t>
+            </w:r>
+          </w:p>
+        </w:tc>
+      </w:tr>
+      <w:tr>
+        <w:trPr>
+          <w:cantSplit/>
+        </w:trPr>
+        <w:tc>
+          <w:tcPr>
+            <w:tcW w:type="dxa" w:w="900"/>
+            <w:vAlign w:val="center"/>
+            <w:tcMar>
+              <w:top w:w="80" w:type="dxa"/>
+              <w:start w:w="100" w:type="dxa"/>
+              <w:bottom w:w="80" w:type="dxa"/>
+              <w:end w:w="100" w:type="dxa"/>
+            </w:tcMar>
+          </w:tcPr>
+          <w:p>
+            <w:pPr>
+              <w:keepNext w:val="0"/>
+              <w:spacing w:after="0"/>
+            </w:pPr>
+            <w:r>
+              <w:rPr>
+                <w:rFonts w:ascii="Times New Roman" w:hAnsi="Times New Roman"/>
+                <w:sz w:val="17"/>
+              </w:rPr>
+              <w:t>PASS</w:t>
+            </w:r>
+          </w:p>
+        </w:tc>
+        <w:tc>
+          <w:tcPr>
+            <w:tcW w:type="dxa" w:w="3400"/>
+            <w:vAlign w:val="center"/>
+            <w:tcMar>
+              <w:top w:w="80" w:type="dxa"/>
+              <w:start w:w="100" w:type="dxa"/>
+              <w:bottom w:w="80" w:type="dxa"/>
+              <w:end w:w="100" w:type="dxa"/>
+            </w:tcMar>
+          </w:tcPr>
+          <w:p>
+            <w:pPr>
+              <w:keepNext w:val="0"/>
+              <w:spacing w:after="0"/>
+            </w:pPr>
+            <w:r>
+              <w:rPr>
+                <w:rFonts w:ascii="Times New Roman" w:hAnsi="Times New Roman"/>
+                <w:sz w:val="17"/>
+              </w:rPr>
+              <w:t>Assessed integrity test: t09_incomplete_wine_composition.sql</w:t>
+            </w:r>
+          </w:p>
+        </w:tc>
+        <w:tc>
+          <w:tcPr>
+            <w:tcW w:type="dxa" w:w="5060"/>
+            <w:vAlign w:val="center"/>
+            <w:tcMar>
+              <w:top w:w="80" w:type="dxa"/>
+              <w:start w:w="100" w:type="dxa"/>
+              <w:bottom w:w="80" w:type="dxa"/>
+              <w:end w:w="100" w:type="dxa"/>
+            </w:tcMar>
+          </w:tcPr>
+          <w:p>
+            <w:pPr>
+              <w:keepNext w:val="0"/>
+              <w:spacing w:after="0"/>
+            </w:pPr>
+            <w:r>
+              <w:rPr>
+                <w:rFonts w:ascii="Times New Roman" w:hAnsi="Times New Roman"/>
+                <w:sz w:val="17"/>
+              </w:rPr>
+              <w:t>exit=1; expected=Wine composition must contain at least one variety and total exactly 100 percent; ERROR 1644 (45000) at line 8: Wine composition must contain at least one variety and total exactly 100 percent</w:t>
+            </w:r>
+          </w:p>
+        </w:tc>
+      </w:tr>
+      <w:tr>
+        <w:trPr>
+          <w:cantSplit/>
+        </w:trPr>
+        <w:tc>
+          <w:tcPr>
+            <w:tcW w:type="dxa" w:w="900"/>
+            <w:vAlign w:val="center"/>
+            <w:tcMar>
+              <w:top w:w="80" w:type="dxa"/>
+              <w:start w:w="100" w:type="dxa"/>
+              <w:bottom w:w="80" w:type="dxa"/>
+              <w:end w:w="100" w:type="dxa"/>
+            </w:tcMar>
+          </w:tcPr>
+          <w:p>
+            <w:pPr>
+              <w:keepNext w:val="0"/>
+              <w:spacing w:after="0"/>
+            </w:pPr>
+            <w:r>
+              <w:rPr>
+                <w:rFonts w:ascii="Times New Roman" w:hAnsi="Times New Roman"/>
+                <w:sz w:val="17"/>
+              </w:rPr>
+              <w:t>PASS</w:t>
+            </w:r>
+          </w:p>
+        </w:tc>
+        <w:tc>
+          <w:tcPr>
+            <w:tcW w:type="dxa" w:w="3400"/>
+            <w:vAlign w:val="center"/>
+            <w:tcMar>
+              <w:top w:w="80" w:type="dxa"/>
+              <w:start w:w="100" w:type="dxa"/>
+              <w:bottom w:w="80" w:type="dxa"/>
+              <w:end w:w="100" w:type="dxa"/>
+            </w:tcMar>
+          </w:tcPr>
+          <w:p>
+            <w:pPr>
+              <w:keepNext w:val="0"/>
+              <w:spacing w:after="0"/>
+            </w:pPr>
+            <w:r>
+              <w:rPr>
+                <w:rFonts w:ascii="Times New Roman" w:hAnsi="Times New Roman"/>
+                <w:sz w:val="17"/>
+              </w:rPr>
+              <w:t>Assessed integrity test: t10_harvest_requires_variety_planting.sql</w:t>
+            </w:r>
+          </w:p>
+        </w:tc>
+        <w:tc>
+          <w:tcPr>
+            <w:tcW w:type="dxa" w:w="5060"/>
+            <w:vAlign w:val="center"/>
+            <w:tcMar>
+              <w:top w:w="80" w:type="dxa"/>
+              <w:start w:w="100" w:type="dxa"/>
+              <w:bottom w:w="80" w:type="dxa"/>
+              <w:end w:w="100" w:type="dxa"/>
+            </w:tcMar>
+          </w:tcPr>
+          <w:p>
+            <w:pPr>
+              <w:keepNext w:val="0"/>
+              <w:spacing w:after="0"/>
+            </w:pPr>
+            <w:r>
+              <w:rPr>
+                <w:rFonts w:ascii="Times New Roman" w:hAnsi="Times New Roman"/>
+                <w:sz w:val="17"/>
+              </w:rPr>
+              <w:t>exit=1; expected=foreign key constraint fails; ERROR 1452 (23000) at line 3: Cannot add or update a child row: a foreign key constraint fails (`cloudrestwines`.`harvest`, CONSTRAINT `fk_harvest_planting` FOREIGN KEY (`vineyardId`, `vintageYear`, `grapeVarietyId`) REFERENCES `vineyardplanting` (`vineyardId`, `vintageYear`, `grapeVar</w:t>
+            </w:r>
+          </w:p>
+        </w:tc>
+      </w:tr>
+      <w:tr>
+        <w:trPr>
+          <w:cantSplit/>
+        </w:trPr>
+        <w:tc>
+          <w:tcPr>
+            <w:tcW w:type="dxa" w:w="900"/>
+            <w:vAlign w:val="center"/>
+            <w:tcMar>
+              <w:top w:w="80" w:type="dxa"/>
+              <w:start w:w="100" w:type="dxa"/>
+              <w:bottom w:w="80" w:type="dxa"/>
+              <w:end w:w="100" w:type="dxa"/>
+            </w:tcMar>
+          </w:tcPr>
+          <w:p>
+            <w:pPr>
+              <w:keepNext w:val="0"/>
+              <w:spacing w:after="0"/>
+            </w:pPr>
+            <w:r>
+              <w:rPr>
+                <w:rFonts w:ascii="Times New Roman" w:hAnsi="Times New Roman"/>
+                <w:sz w:val="17"/>
+              </w:rPr>
+              <w:t>PASS</w:t>
+            </w:r>
+          </w:p>
+        </w:tc>
+        <w:tc>
+          <w:tcPr>
+            <w:tcW w:type="dxa" w:w="3400"/>
+            <w:vAlign w:val="center"/>
+            <w:tcMar>
+              <w:top w:w="80" w:type="dxa"/>
+              <w:start w:w="100" w:type="dxa"/>
+              <w:bottom w:w="80" w:type="dxa"/>
+              <w:end w:w="100" w:type="dxa"/>
+            </w:tcMar>
+          </w:tcPr>
+          <w:p>
+            <w:pPr>
+              <w:keepNext w:val="0"/>
+              <w:spacing w:after="0"/>
+            </w:pPr>
+            <w:r>
+              <w:rPr>
+                <w:rFonts w:ascii="Times New Roman" w:hAnsi="Times New Roman"/>
+                <w:sz w:val="17"/>
+              </w:rPr>
+              <w:t>Assessed integrity test: t11_refund_requires_order_product.sql</w:t>
+            </w:r>
+          </w:p>
+        </w:tc>
+        <w:tc>
+          <w:tcPr>
+            <w:tcW w:type="dxa" w:w="5060"/>
+            <w:vAlign w:val="center"/>
+            <w:tcMar>
+              <w:top w:w="80" w:type="dxa"/>
+              <w:start w:w="100" w:type="dxa"/>
+              <w:bottom w:w="80" w:type="dxa"/>
+              <w:end w:w="100" w:type="dxa"/>
+            </w:tcMar>
+          </w:tcPr>
+          <w:p>
+            <w:pPr>
+              <w:keepNext w:val="0"/>
+              <w:spacing w:after="0"/>
+            </w:pPr>
+            <w:r>
+              <w:rPr>
+                <w:rFonts w:ascii="Times New Roman" w:hAnsi="Times New Roman"/>
+                <w:sz w:val="17"/>
+              </w:rPr>
+              <w:t>exit=1; expected=foreign key constraint fails; ERROR 1452 (23000) at line 3: Cannot add or update a child row: a foreign key constraint fails (`cloudrestwines`.`refund`, CONSTRAINT `fk_refund_orderline` FOREIGN KEY (`customerOrderId`, `productId`) REFERENCES `orderline` (`customerOrderId`, `productId`) ON DELETE RESTRICT ON UPDATE</w:t>
+            </w:r>
+          </w:p>
+        </w:tc>
+      </w:tr>
+      <w:tr>
+        <w:trPr>
+          <w:cantSplit/>
+        </w:trPr>
+        <w:tc>
+          <w:tcPr>
+            <w:tcW w:type="dxa" w:w="900"/>
+            <w:vAlign w:val="center"/>
+            <w:tcMar>
+              <w:top w:w="80" w:type="dxa"/>
+              <w:start w:w="100" w:type="dxa"/>
+              <w:bottom w:w="80" w:type="dxa"/>
+              <w:end w:w="100" w:type="dxa"/>
+            </w:tcMar>
+          </w:tcPr>
+          <w:p>
+            <w:pPr>
+              <w:keepNext w:val="0"/>
+              <w:spacing w:after="0"/>
+            </w:pPr>
+            <w:r>
+              <w:rPr>
+                <w:rFonts w:ascii="Times New Roman" w:hAnsi="Times New Roman"/>
+                <w:sz w:val="17"/>
+              </w:rPr>
+              <w:t>PASS</w:t>
+            </w:r>
+          </w:p>
+        </w:tc>
+        <w:tc>
+          <w:tcPr>
+            <w:tcW w:type="dxa" w:w="3400"/>
+            <w:vAlign w:val="center"/>
+            <w:tcMar>
+              <w:top w:w="80" w:type="dxa"/>
+              <w:start w:w="100" w:type="dxa"/>
+              <w:bottom w:w="80" w:type="dxa"/>
+              <w:end w:w="100" w:type="dxa"/>
+            </w:tcMar>
+          </w:tcPr>
+          <w:p>
+            <w:pPr>
+              <w:keepNext w:val="0"/>
               <w:spacing w:after="0"/>
             </w:pPr>
             <w:r>
@@ -2881,6 +3827,7 @@
           </w:tcPr>
           <w:p>
             <w:pPr>
+              <w:keepNext w:val="0"/>
               <w:spacing w:after="0"/>
             </w:pPr>
             <w:r>
@@ -2894,6 +3841,9 @@
         </w:tc>
       </w:tr>
       <w:tr>
+        <w:trPr>
+          <w:cantSplit/>
+        </w:trPr>
         <w:tc>
           <w:tcPr>
             <w:tcW w:type="dxa" w:w="900"/>
@@ -2907,6 +3857,7 @@
           </w:tcPr>
           <w:p>
             <w:pPr>
+              <w:keepNext w:val="0"/>
               <w:spacing w:after="0"/>
             </w:pPr>
             <w:r>
@@ -2931,6 +3882,7 @@
           </w:tcPr>
           <w:p>
             <w:pPr>
+              <w:keepNext w:val="0"/>
               <w:spacing w:after="0"/>
             </w:pPr>
             <w:r>
@@ -2955,6 +3907,7 @@
           </w:tcPr>
           <w:p>
             <w:pPr>
+              <w:keepNext w:val="0"/>
               <w:spacing w:after="0"/>
             </w:pPr>
             <w:r>
@@ -2968,6 +3921,9 @@
         </w:tc>
       </w:tr>
       <w:tr>
+        <w:trPr>
+          <w:cantSplit/>
+        </w:trPr>
         <w:tc>
           <w:tcPr>
             <w:tcW w:type="dxa" w:w="900"/>
@@ -2981,6 +3937,7 @@
           </w:tcPr>
           <w:p>
             <w:pPr>
+              <w:keepNext w:val="0"/>
               <w:spacing w:after="0"/>
             </w:pPr>
             <w:r>
@@ -3005,6 +3962,7 @@
           </w:tcPr>
           <w:p>
             <w:pPr>
+              <w:keepNext w:val="0"/>
               <w:spacing w:after="0"/>
             </w:pPr>
             <w:r>
@@ -3029,6 +3987,7 @@
           </w:tcPr>
           <w:p>
             <w:pPr>
+              <w:keepNext w:val="0"/>
               <w:spacing w:after="0"/>
             </w:pPr>
             <w:r>
@@ -3042,6 +4001,9 @@
         </w:tc>
       </w:tr>
       <w:tr>
+        <w:trPr>
+          <w:cantSplit/>
+        </w:trPr>
         <w:tc>
           <w:tcPr>
             <w:tcW w:type="dxa" w:w="900"/>
@@ -3055,6 +4017,7 @@
           </w:tcPr>
           <w:p>
             <w:pPr>
+              <w:keepNext w:val="0"/>
               <w:spacing w:after="0"/>
             </w:pPr>
             <w:r>
@@ -3079,6 +4042,7 @@
           </w:tcPr>
           <w:p>
             <w:pPr>
+              <w:keepNext w:val="0"/>
               <w:spacing w:after="0"/>
             </w:pPr>
             <w:r>
@@ -3103,6 +4067,7 @@
           </w:tcPr>
           <w:p>
             <w:pPr>
+              <w:keepNext w:val="0"/>
               <w:spacing w:after="0"/>
             </w:pPr>
             <w:r>
@@ -3116,6 +4081,9 @@
         </w:tc>
       </w:tr>
       <w:tr>
+        <w:trPr>
+          <w:cantSplit/>
+        </w:trPr>
         <w:tc>
           <w:tcPr>
             <w:tcW w:type="dxa" w:w="900"/>
@@ -3129,6 +4097,7 @@
           </w:tcPr>
           <w:p>
             <w:pPr>
+              <w:keepNext w:val="0"/>
               <w:spacing w:after="0"/>
             </w:pPr>
             <w:r>
@@ -3153,6 +4122,7 @@
           </w:tcPr>
           <w:p>
             <w:pPr>
+              <w:keepNext w:val="0"/>
               <w:spacing w:after="0"/>
             </w:pPr>
             <w:r>
@@ -3177,6 +4147,7 @@
           </w:tcPr>
           <w:p>
             <w:pPr>
+              <w:keepNext w:val="0"/>
               <w:spacing w:after="0"/>
             </w:pPr>
             <w:r>
@@ -3190,6 +4161,9 @@
         </w:tc>
       </w:tr>
       <w:tr>
+        <w:trPr>
+          <w:cantSplit/>
+        </w:trPr>
         <w:tc>
           <w:tcPr>
             <w:tcW w:type="dxa" w:w="900"/>
@@ -3203,6 +4177,7 @@
           </w:tcPr>
           <w:p>
             <w:pPr>
+              <w:keepNext w:val="0"/>
               <w:spacing w:after="0"/>
             </w:pPr>
             <w:r>
@@ -3227,6 +4202,7 @@
           </w:tcPr>
           <w:p>
             <w:pPr>
+              <w:keepNext w:val="0"/>
               <w:spacing w:after="0"/>
             </w:pPr>
             <w:r>
@@ -3251,6 +4227,7 @@
           </w:tcPr>
           <w:p>
             <w:pPr>
+              <w:keepNext w:val="0"/>
               <w:spacing w:after="0"/>
             </w:pPr>
             <w:r>
@@ -3264,6 +4241,9 @@
         </w:tc>
       </w:tr>
       <w:tr>
+        <w:trPr>
+          <w:cantSplit/>
+        </w:trPr>
         <w:tc>
           <w:tcPr>
             <w:tcW w:type="dxa" w:w="900"/>
@@ -3277,6 +4257,7 @@
           </w:tcPr>
           <w:p>
             <w:pPr>
+              <w:keepNext w:val="0"/>
               <w:spacing w:after="0"/>
             </w:pPr>
             <w:r>
@@ -3301,6 +4282,7 @@
           </w:tcPr>
           <w:p>
             <w:pPr>
+              <w:keepNext w:val="0"/>
               <w:spacing w:after="0"/>
             </w:pPr>
             <w:r>
@@ -3325,6 +4307,7 @@
           </w:tcPr>
           <w:p>
             <w:pPr>
+              <w:keepNext w:val="0"/>
               <w:spacing w:after="0"/>
             </w:pPr>
             <w:r>
@@ -3338,6 +4321,9 @@
         </w:tc>
       </w:tr>
       <w:tr>
+        <w:trPr>
+          <w:cantSplit/>
+        </w:trPr>
         <w:tc>
           <w:tcPr>
             <w:tcW w:type="dxa" w:w="900"/>
@@ -3351,6 +4337,7 @@
           </w:tcPr>
           <w:p>
             <w:pPr>
+              <w:keepNext w:val="0"/>
               <w:spacing w:after="0"/>
             </w:pPr>
             <w:r>
@@ -3375,6 +4362,7 @@
           </w:tcPr>
           <w:p>
             <w:pPr>
+              <w:keepNext w:val="0"/>
               <w:spacing w:after="0"/>
             </w:pPr>
             <w:r>
@@ -3399,6 +4387,7 @@
           </w:tcPr>
           <w:p>
             <w:pPr>
+              <w:keepNext w:val="0"/>
               <w:spacing w:after="0"/>
             </w:pPr>
             <w:r>
@@ -3412,6 +4401,9 @@
         </w:tc>
       </w:tr>
       <w:tr>
+        <w:trPr>
+          <w:cantSplit/>
+        </w:trPr>
         <w:tc>
           <w:tcPr>
             <w:tcW w:type="dxa" w:w="900"/>
@@ -3425,6 +4417,7 @@
           </w:tcPr>
           <w:p>
             <w:pPr>
+              <w:keepNext w:val="0"/>
               <w:spacing w:after="0"/>
             </w:pPr>
             <w:r>
@@ -3449,6 +4442,7 @@
           </w:tcPr>
           <w:p>
             <w:pPr>
+              <w:keepNext w:val="0"/>
               <w:spacing w:after="0"/>
             </w:pPr>
             <w:r>
@@ -3473,6 +4467,7 @@
           </w:tcPr>
           <w:p>
             <w:pPr>
+              <w:keepNext w:val="0"/>
               <w:spacing w:after="0"/>
             </w:pPr>
             <w:r>
@@ -3486,6 +4481,9 @@
         </w:tc>
       </w:tr>
       <w:tr>
+        <w:trPr>
+          <w:cantSplit/>
+        </w:trPr>
         <w:tc>
           <w:tcPr>
             <w:tcW w:type="dxa" w:w="900"/>
@@ -3499,6 +4497,7 @@
           </w:tcPr>
           <w:p>
             <w:pPr>
+              <w:keepNext w:val="0"/>
               <w:spacing w:after="0"/>
             </w:pPr>
             <w:r>
@@ -3523,6 +4522,7 @@
           </w:tcPr>
           <w:p>
             <w:pPr>
+              <w:keepNext w:val="0"/>
               <w:spacing w:after="0"/>
             </w:pPr>
             <w:r>
@@ -3547,6 +4547,7 @@
           </w:tcPr>
           <w:p>
             <w:pPr>
+              <w:keepNext w:val="0"/>
               <w:spacing w:after="0"/>
             </w:pPr>
             <w:r>
@@ -3560,6 +4561,9 @@
         </w:tc>
       </w:tr>
       <w:tr>
+        <w:trPr>
+          <w:cantSplit/>
+        </w:trPr>
         <w:tc>
           <w:tcPr>
             <w:tcW w:type="dxa" w:w="900"/>
@@ -3573,6 +4577,7 @@
           </w:tcPr>
           <w:p>
             <w:pPr>
+              <w:keepNext w:val="0"/>
               <w:spacing w:after="0"/>
             </w:pPr>
             <w:r>
@@ -3597,6 +4602,7 @@
           </w:tcPr>
           <w:p>
             <w:pPr>
+              <w:keepNext w:val="0"/>
               <w:spacing w:after="0"/>
             </w:pPr>
             <w:r>
@@ -3621,6 +4627,7 @@
           </w:tcPr>
           <w:p>
             <w:pPr>
+              <w:keepNext w:val="0"/>
               <w:spacing w:after="0"/>
             </w:pPr>
             <w:r>
@@ -3634,6 +4641,9 @@
         </w:tc>
       </w:tr>
       <w:tr>
+        <w:trPr>
+          <w:cantSplit/>
+        </w:trPr>
         <w:tc>
           <w:tcPr>
             <w:tcW w:type="dxa" w:w="900"/>
@@ -3647,6 +4657,7 @@
           </w:tcPr>
           <w:p>
             <w:pPr>
+              <w:keepNext w:val="0"/>
               <w:spacing w:after="0"/>
             </w:pPr>
             <w:r>
@@ -3671,6 +4682,7 @@
           </w:tcPr>
           <w:p>
             <w:pPr>
+              <w:keepNext w:val="0"/>
               <w:spacing w:after="0"/>
             </w:pPr>
             <w:r>
@@ -3695,6 +4707,7 @@
           </w:tcPr>
           <w:p>
             <w:pPr>
+              <w:keepNext w:val="0"/>
               <w:spacing w:after="0"/>
             </w:pPr>
             <w:r>
@@ -3708,6 +4721,9 @@
         </w:tc>
       </w:tr>
       <w:tr>
+        <w:trPr>
+          <w:cantSplit/>
+        </w:trPr>
         <w:tc>
           <w:tcPr>
             <w:tcW w:type="dxa" w:w="900"/>
@@ -3721,6 +4737,7 @@
           </w:tcPr>
           <w:p>
             <w:pPr>
+              <w:keepNext w:val="0"/>
               <w:spacing w:after="0"/>
             </w:pPr>
             <w:r>
@@ -3745,6 +4762,7 @@
           </w:tcPr>
           <w:p>
             <w:pPr>
+              <w:keepNext w:val="0"/>
               <w:spacing w:after="0"/>
             </w:pPr>
             <w:r>
@@ -3769,6 +4787,7 @@
           </w:tcPr>
           <w:p>
             <w:pPr>
+              <w:keepNext w:val="0"/>
               <w:spacing w:after="0"/>
             </w:pPr>
             <w:r>
@@ -3782,6 +4801,9 @@
         </w:tc>
       </w:tr>
       <w:tr>
+        <w:trPr>
+          <w:cantSplit/>
+        </w:trPr>
         <w:tc>
           <w:tcPr>
             <w:tcW w:type="dxa" w:w="900"/>
@@ -3795,6 +4817,7 @@
           </w:tcPr>
           <w:p>
             <w:pPr>
+              <w:keepNext w:val="0"/>
               <w:spacing w:after="0"/>
             </w:pPr>
             <w:r>
@@ -3819,6 +4842,7 @@
           </w:tcPr>
           <w:p>
             <w:pPr>
+              <w:keepNext w:val="0"/>
               <w:spacing w:after="0"/>
             </w:pPr>
             <w:r>
@@ -3843,6 +4867,7 @@
           </w:tcPr>
           <w:p>
             <w:pPr>
+              <w:keepNext w:val="0"/>
               <w:spacing w:after="0"/>
             </w:pPr>
             <w:r>
@@ -3856,6 +4881,9 @@
         </w:tc>
       </w:tr>
       <w:tr>
+        <w:trPr>
+          <w:cantSplit/>
+        </w:trPr>
         <w:tc>
           <w:tcPr>
             <w:tcW w:type="dxa" w:w="900"/>
@@ -3869,6 +4897,7 @@
           </w:tcPr>
           <w:p>
             <w:pPr>
+              <w:keepNext w:val="0"/>
               <w:spacing w:after="0"/>
             </w:pPr>
             <w:r>
@@ -3893,6 +4922,7 @@
           </w:tcPr>
           <w:p>
             <w:pPr>
+              <w:keepNext w:val="0"/>
               <w:spacing w:after="0"/>
             </w:pPr>
             <w:r>
@@ -3917,6 +4947,7 @@
           </w:tcPr>
           <w:p>
             <w:pPr>
+              <w:keepNext w:val="0"/>
               <w:spacing w:after="0"/>
             </w:pPr>
             <w:r>
@@ -3930,6 +4961,9 @@
         </w:tc>
       </w:tr>
       <w:tr>
+        <w:trPr>
+          <w:cantSplit/>
+        </w:trPr>
         <w:tc>
           <w:tcPr>
             <w:tcW w:type="dxa" w:w="900"/>
@@ -3943,6 +4977,7 @@
           </w:tcPr>
           <w:p>
             <w:pPr>
+              <w:keepNext w:val="0"/>
               <w:spacing w:after="0"/>
             </w:pPr>
             <w:r>
@@ -3967,6 +5002,7 @@
           </w:tcPr>
           <w:p>
             <w:pPr>
+              <w:keepNext w:val="0"/>
               <w:spacing w:after="0"/>
             </w:pPr>
             <w:r>
@@ -3991,6 +5027,7 @@
           </w:tcPr>
           <w:p>
             <w:pPr>
+              <w:keepNext w:val="0"/>
               <w:spacing w:after="0"/>
             </w:pPr>
             <w:r>
@@ -4004,6 +5041,9 @@
         </w:tc>
       </w:tr>
       <w:tr>
+        <w:trPr>
+          <w:cantSplit/>
+        </w:trPr>
         <w:tc>
           <w:tcPr>
             <w:tcW w:type="dxa" w:w="900"/>
@@ -4017,6 +5057,7 @@
           </w:tcPr>
           <w:p>
             <w:pPr>
+              <w:keepNext w:val="0"/>
               <w:spacing w:after="0"/>
             </w:pPr>
             <w:r>
@@ -4041,6 +5082,7 @@
           </w:tcPr>
           <w:p>
             <w:pPr>
+              <w:keepNext w:val="0"/>
               <w:spacing w:after="0"/>
             </w:pPr>
             <w:r>
@@ -4065,6 +5107,7 @@
           </w:tcPr>
           <w:p>
             <w:pPr>
+              <w:keepNext w:val="0"/>
               <w:spacing w:after="0"/>
             </w:pPr>
             <w:r>
@@ -4078,6 +5121,9 @@
         </w:tc>
       </w:tr>
       <w:tr>
+        <w:trPr>
+          <w:cantSplit/>
+        </w:trPr>
         <w:tc>
           <w:tcPr>
             <w:tcW w:type="dxa" w:w="900"/>
@@ -4091,6 +5137,7 @@
           </w:tcPr>
           <w:p>
             <w:pPr>
+              <w:keepNext w:val="0"/>
               <w:spacing w:after="0"/>
             </w:pPr>
             <w:r>
@@ -4115,6 +5162,7 @@
           </w:tcPr>
           <w:p>
             <w:pPr>
+              <w:keepNext w:val="0"/>
               <w:spacing w:after="0"/>
             </w:pPr>
             <w:r>
@@ -4139,6 +5187,7 @@
           </w:tcPr>
           <w:p>
             <w:pPr>
+              <w:keepNext w:val="0"/>
               <w:spacing w:after="0"/>
             </w:pPr>
             <w:r>
@@ -4152,6 +5201,9 @@
         </w:tc>
       </w:tr>
       <w:tr>
+        <w:trPr>
+          <w:cantSplit/>
+        </w:trPr>
         <w:tc>
           <w:tcPr>
             <w:tcW w:type="dxa" w:w="900"/>
@@ -4165,6 +5217,7 @@
           </w:tcPr>
           <w:p>
             <w:pPr>
+              <w:keepNext w:val="0"/>
               <w:spacing w:after="0"/>
             </w:pPr>
             <w:r>
@@ -4189,6 +5242,7 @@
           </w:tcPr>
           <w:p>
             <w:pPr>
+              <w:keepNext w:val="0"/>
               <w:spacing w:after="0"/>
             </w:pPr>
             <w:r>
@@ -4213,6 +5267,7 @@
           </w:tcPr>
           <w:p>
             <w:pPr>
+              <w:keepNext w:val="0"/>
               <w:spacing w:after="0"/>
             </w:pPr>
             <w:r>
@@ -4226,6 +5281,9 @@
         </w:tc>
       </w:tr>
       <w:tr>
+        <w:trPr>
+          <w:cantSplit/>
+        </w:trPr>
         <w:tc>
           <w:tcPr>
             <w:tcW w:type="dxa" w:w="900"/>
@@ -4239,6 +5297,7 @@
           </w:tcPr>
           <w:p>
             <w:pPr>
+              <w:keepNext w:val="0"/>
               <w:spacing w:after="0"/>
             </w:pPr>
             <w:r>
@@ -4263,6 +5322,7 @@
           </w:tcPr>
           <w:p>
             <w:pPr>
+              <w:keepNext w:val="0"/>
               <w:spacing w:after="0"/>
             </w:pPr>
             <w:r>
@@ -4287,6 +5347,7 @@
           </w:tcPr>
           <w:p>
             <w:pPr>
+              <w:keepNext w:val="0"/>
               <w:spacing w:after="0"/>
             </w:pPr>
             <w:r>
@@ -4300,6 +5361,9 @@
         </w:tc>
       </w:tr>
       <w:tr>
+        <w:trPr>
+          <w:cantSplit/>
+        </w:trPr>
         <w:tc>
           <w:tcPr>
             <w:tcW w:type="dxa" w:w="900"/>
@@ -4313,6 +5377,7 @@
           </w:tcPr>
           <w:p>
             <w:pPr>
+              <w:keepNext w:val="0"/>
               <w:spacing w:after="0"/>
             </w:pPr>
             <w:r>
@@ -4337,6 +5402,7 @@
           </w:tcPr>
           <w:p>
             <w:pPr>
+              <w:keepNext w:val="0"/>
               <w:spacing w:after="0"/>
             </w:pPr>
             <w:r>
@@ -4361,6 +5427,7 @@
           </w:tcPr>
           <w:p>
             <w:pPr>
+              <w:keepNext w:val="0"/>
               <w:spacing w:after="0"/>
             </w:pPr>
             <w:r>
@@ -4374,6 +5441,9 @@
         </w:tc>
       </w:tr>
       <w:tr>
+        <w:trPr>
+          <w:cantSplit/>
+        </w:trPr>
         <w:tc>
           <w:tcPr>
             <w:tcW w:type="dxa" w:w="900"/>
@@ -4387,6 +5457,7 @@
           </w:tcPr>
           <w:p>
             <w:pPr>
+              <w:keepNext w:val="0"/>
               <w:spacing w:after="0"/>
             </w:pPr>
             <w:r>
@@ -4411,6 +5482,7 @@
           </w:tcPr>
           <w:p>
             <w:pPr>
+              <w:keepNext w:val="0"/>
               <w:spacing w:after="0"/>
             </w:pPr>
             <w:r>
@@ -4435,6 +5507,7 @@
           </w:tcPr>
           <w:p>
             <w:pPr>
+              <w:keepNext w:val="0"/>
               <w:spacing w:after="0"/>
             </w:pPr>
             <w:r>
@@ -4442,12 +5515,15 @@
                 <w:rFonts w:ascii="Times New Roman" w:hAnsi="Times New Roman"/>
                 <w:sz w:val="17"/>
               </w:rPr>
-              <w:t>resolution=(1586, 2551)</w:t>
+              <w:t>resolution=(3327, 2245)</w:t>
             </w:r>
           </w:p>
         </w:tc>
       </w:tr>
       <w:tr>
+        <w:trPr>
+          <w:cantSplit/>
+        </w:trPr>
         <w:tc>
           <w:tcPr>
             <w:tcW w:type="dxa" w:w="900"/>
@@ -4461,6 +5537,7 @@
           </w:tcPr>
           <w:p>
             <w:pPr>
+              <w:keepNext w:val="0"/>
               <w:spacing w:after="0"/>
             </w:pPr>
             <w:r>
@@ -4485,6 +5562,7 @@
           </w:tcPr>
           <w:p>
             <w:pPr>
+              <w:keepNext w:val="0"/>
               <w:spacing w:after="0"/>
             </w:pPr>
             <w:r>
@@ -4509,6 +5587,7 @@
           </w:tcPr>
           <w:p>
             <w:pPr>
+              <w:keepNext w:val="0"/>
               <w:spacing w:after="0"/>
             </w:pPr>
             <w:r>
@@ -4522,6 +5601,9 @@
         </w:tc>
       </w:tr>
       <w:tr>
+        <w:trPr>
+          <w:cantSplit/>
+        </w:trPr>
         <w:tc>
           <w:tcPr>
             <w:tcW w:type="dxa" w:w="900"/>
@@ -4535,6 +5617,7 @@
           </w:tcPr>
           <w:p>
             <w:pPr>
+              <w:keepNext w:val="0"/>
               <w:spacing w:after="0"/>
             </w:pPr>
             <w:r>
@@ -4559,6 +5642,7 @@
           </w:tcPr>
           <w:p>
             <w:pPr>
+              <w:keepNext w:val="0"/>
               <w:spacing w:after="0"/>
             </w:pPr>
             <w:r>
@@ -4583,6 +5667,7 @@
           </w:tcPr>
           <w:p>
             <w:pPr>
+              <w:keepNext w:val="0"/>
               <w:spacing w:after="0"/>
             </w:pPr>
             <w:r>
@@ -4596,6 +5681,9 @@
         </w:tc>
       </w:tr>
       <w:tr>
+        <w:trPr>
+          <w:cantSplit/>
+        </w:trPr>
         <w:tc>
           <w:tcPr>
             <w:tcW w:type="dxa" w:w="900"/>
@@ -4609,6 +5697,7 @@
           </w:tcPr>
           <w:p>
             <w:pPr>
+              <w:keepNext w:val="0"/>
               <w:spacing w:after="0"/>
             </w:pPr>
             <w:r>
@@ -4633,6 +5722,7 @@
           </w:tcPr>
           <w:p>
             <w:pPr>
+              <w:keepNext w:val="0"/>
               <w:spacing w:after="0"/>
             </w:pPr>
             <w:r>
@@ -4657,6 +5747,7 @@
           </w:tcPr>
           <w:p>
             <w:pPr>
+              <w:keepNext w:val="0"/>
               <w:spacing w:after="0"/>
             </w:pPr>
             <w:r>
@@ -4670,6 +5761,9 @@
         </w:tc>
       </w:tr>
       <w:tr>
+        <w:trPr>
+          <w:cantSplit/>
+        </w:trPr>
         <w:tc>
           <w:tcPr>
             <w:tcW w:type="dxa" w:w="900"/>
@@ -4683,6 +5777,7 @@
           </w:tcPr>
           <w:p>
             <w:pPr>
+              <w:keepNext w:val="0"/>
               <w:spacing w:after="0"/>
             </w:pPr>
             <w:r>
@@ -4707,6 +5802,7 @@
           </w:tcPr>
           <w:p>
             <w:pPr>
+              <w:keepNext w:val="0"/>
               <w:spacing w:after="0"/>
             </w:pPr>
             <w:r>
@@ -4731,6 +5827,7 @@
           </w:tcPr>
           <w:p>
             <w:pPr>
+              <w:keepNext w:val="0"/>
               <w:spacing w:after="0"/>
             </w:pPr>
             <w:r>
@@ -4744,6 +5841,9 @@
         </w:tc>
       </w:tr>
       <w:tr>
+        <w:trPr>
+          <w:cantSplit/>
+        </w:trPr>
         <w:tc>
           <w:tcPr>
             <w:tcW w:type="dxa" w:w="900"/>
@@ -4757,6 +5857,7 @@
           </w:tcPr>
           <w:p>
             <w:pPr>
+              <w:keepNext w:val="0"/>
               <w:spacing w:after="0"/>
             </w:pPr>
             <w:r>
@@ -4781,6 +5882,7 @@
           </w:tcPr>
           <w:p>
             <w:pPr>
+              <w:keepNext w:val="0"/>
               <w:spacing w:after="0"/>
             </w:pPr>
             <w:r>
@@ -4805,6 +5907,7 @@
           </w:tcPr>
           <w:p>
             <w:pPr>
+              <w:keepNext w:val="0"/>
               <w:spacing w:after="0"/>
             </w:pPr>
             <w:r>
@@ -4818,6 +5921,9 @@
         </w:tc>
       </w:tr>
       <w:tr>
+        <w:trPr>
+          <w:cantSplit/>
+        </w:trPr>
         <w:tc>
           <w:tcPr>
             <w:tcW w:type="dxa" w:w="900"/>
@@ -4831,6 +5937,7 @@
           </w:tcPr>
           <w:p>
             <w:pPr>
+              <w:keepNext w:val="0"/>
               <w:spacing w:after="0"/>
             </w:pPr>
             <w:r>
@@ -4855,6 +5962,7 @@
           </w:tcPr>
           <w:p>
             <w:pPr>
+              <w:keepNext w:val="0"/>
               <w:spacing w:after="0"/>
             </w:pPr>
             <w:r>
@@ -4879,6 +5987,7 @@
           </w:tcPr>
           <w:p>
             <w:pPr>
+              <w:keepNext w:val="0"/>
               <w:spacing w:after="0"/>
             </w:pPr>
             <w:r>
@@ -4892,6 +6001,9 @@
         </w:tc>
       </w:tr>
       <w:tr>
+        <w:trPr>
+          <w:cantSplit/>
+        </w:trPr>
         <w:tc>
           <w:tcPr>
             <w:tcW w:type="dxa" w:w="900"/>
@@ -4905,6 +6017,7 @@
           </w:tcPr>
           <w:p>
             <w:pPr>
+              <w:keepNext w:val="0"/>
               <w:spacing w:after="0"/>
             </w:pPr>
             <w:r>
@@ -4929,6 +6042,7 @@
           </w:tcPr>
           <w:p>
             <w:pPr>
+              <w:keepNext w:val="0"/>
               <w:spacing w:after="0"/>
             </w:pPr>
             <w:r>
@@ -4953,6 +6067,7 @@
           </w:tcPr>
           <w:p>
             <w:pPr>
+              <w:keepNext w:val="0"/>
               <w:spacing w:after="0"/>
             </w:pPr>
             <w:r>
@@ -4966,6 +6081,9 @@
         </w:tc>
       </w:tr>
       <w:tr>
+        <w:trPr>
+          <w:cantSplit/>
+        </w:trPr>
         <w:tc>
           <w:tcPr>
             <w:tcW w:type="dxa" w:w="900"/>
@@ -4979,6 +6097,7 @@
           </w:tcPr>
           <w:p>
             <w:pPr>
+              <w:keepNext w:val="0"/>
               <w:spacing w:after="0"/>
             </w:pPr>
             <w:r>
@@ -5003,6 +6122,7 @@
           </w:tcPr>
           <w:p>
             <w:pPr>
+              <w:keepNext w:val="0"/>
               <w:spacing w:after="0"/>
             </w:pPr>
             <w:r>
@@ -5027,6 +6147,7 @@
           </w:tcPr>
           <w:p>
             <w:pPr>
+              <w:keepNext w:val="0"/>
               <w:spacing w:after="0"/>
             </w:pPr>
             <w:r>
@@ -5040,6 +6161,9 @@
         </w:tc>
       </w:tr>
       <w:tr>
+        <w:trPr>
+          <w:cantSplit/>
+        </w:trPr>
         <w:tc>
           <w:tcPr>
             <w:tcW w:type="dxa" w:w="900"/>
@@ -5053,6 +6177,7 @@
           </w:tcPr>
           <w:p>
             <w:pPr>
+              <w:keepNext w:val="0"/>
               <w:spacing w:after="0"/>
             </w:pPr>
             <w:r>
@@ -5077,6 +6202,7 @@
           </w:tcPr>
           <w:p>
             <w:pPr>
+              <w:keepNext w:val="0"/>
               <w:spacing w:after="0"/>
             </w:pPr>
             <w:r>
@@ -5101,6 +6227,7 @@
           </w:tcPr>
           <w:p>
             <w:pPr>
+              <w:keepNext w:val="0"/>
               <w:spacing w:after="0"/>
             </w:pPr>
             <w:r>
@@ -5114,6 +6241,9 @@
         </w:tc>
       </w:tr>
       <w:tr>
+        <w:trPr>
+          <w:cantSplit/>
+        </w:trPr>
         <w:tc>
           <w:tcPr>
             <w:tcW w:type="dxa" w:w="900"/>
@@ -5127,6 +6257,7 @@
           </w:tcPr>
           <w:p>
             <w:pPr>
+              <w:keepNext w:val="0"/>
               <w:spacing w:after="0"/>
             </w:pPr>
             <w:r>
@@ -5151,6 +6282,7 @@
           </w:tcPr>
           <w:p>
             <w:pPr>
+              <w:keepNext w:val="0"/>
               <w:spacing w:after="0"/>
             </w:pPr>
             <w:r>
@@ -5158,7 +6290,7 @@
                 <w:rFonts w:ascii="Times New Roman" w:hAnsi="Times New Roman"/>
                 <w:sz w:val="17"/>
               </w:rPr>
-              <w:t>Development mode honestly retains placeholders</w:t>
+              <w:t>Development mode discloses remaining human inputs</w:t>
             </w:r>
           </w:p>
         </w:tc>
@@ -5175,6 +6307,7 @@
           </w:tcPr>
           <w:p>
             <w:pPr>
+              <w:keepNext w:val="0"/>
               <w:spacing w:after="0"/>
             </w:pPr>
             <w:r>
@@ -5182,7 +6315,7 @@
                 <w:rFonts w:ascii="Times New Roman" w:hAnsi="Times New Roman"/>
                 <w:sz w:val="17"/>
               </w:rPr>
-              <w:t>FINAL_MODE=0</w:t>
+              <w:t>FINAL_MODE=0; unresolved human inputs disclosed</w:t>
             </w:r>
           </w:p>
         </w:tc>
@@ -5211,7 +6344,7 @@
           <w:i w:val="0"/>
           <w:sz w:val="24"/>
         </w:rPr>
-        <w:t>Official A2 workbook and actual cleaning evidence.</w:t>
+        <w:t>Final resolution of ambiguous repeated Order Id + Product Id rows in the official A2 v4 workbook.</w:t>
       </w:r>
     </w:p>
     <w:p>
@@ -5224,7 +6357,7 @@
           <w:i w:val="0"/>
           <w:sz w:val="24"/>
         </w:rPr>
-        <w:t>Week 11 assigned business scenario.</w:t>
+        <w:t>Submitting students review genuine local Workbench staging/cleaning and integrity screenshots; recapture if course policy requires their own account.</w:t>
       </w:r>
     </w:p>
     <w:p>
@@ -5237,7 +6370,7 @@
           <w:i w:val="0"/>
           <w:sz w:val="24"/>
         </w:rPr>
-        <w:t>Genuine student Workbench screenshots.</w:t>
+        <w:t>Week 11 assigned business scenario if not yet supplied.</w:t>
       </w:r>
     </w:p>
     <w:p>
@@ -5263,7 +6396,7 @@
           <w:i w:val="0"/>
           <w:sz w:val="24"/>
         </w:rPr>
-        <w:t>Replacement of member 1 and submission date.</w:t>
+        <w:t>Mapping of the Mia/Zora/Rianna/Jason draft aliases to the four signed Team Charter members, plus final submission date.</w:t>
       </w:r>
     </w:p>
     <w:p>
@@ -5312,7 +6445,7 @@
         <w:color w:val="5B6573"/>
         <w:sz w:val="18"/>
       </w:rPr>
-      <w:t xml:space="preserve">Cloudrest Wines — Confidential assessment draft | </w:t>
+      <w:t xml:space="preserve">Cloudrest Wines | </w:t>
     </w:r>
     <w:r/>
     <w:fldSimple w:instr="PAGE"/>

</xml_diff>

<commit_message>
Import bounded cleaned v4 data and finalize report delivery
</commit_message>
<xml_diff>
--- a/deliverables/final-submission/Cloudrest_Wines_Verification_Report.docx
+++ b/deliverables/final-submission/Cloudrest_Wines_Verification_Report.docx
@@ -189,7 +189,7 @@
                 <w:rFonts w:ascii="Times New Roman" w:hAnsi="Times New Roman"/>
                 <w:sz w:val="20"/>
               </w:rPr>
-              <w:t>2026-10-07T20:43:51</w:t>
+              <w:t>2026-10-08T01:15:05</w:t>
             </w:r>
           </w:p>
         </w:tc>
@@ -2871,7 +2871,7 @@
                 <w:rFonts w:ascii="Times New Roman" w:hAnsi="Times New Roman"/>
                 <w:sz w:val="17"/>
               </w:rPr>
-              <w:t xml:space="preserve">exit=0, chars=971, </w:t>
+              <w:t xml:space="preserve">exit=0, chars=944, </w:t>
             </w:r>
           </w:p>
         </w:tc>

</xml_diff>

<commit_message>
final: regenerate Hint 7-11 SQL, model, dictionary and Word reports
</commit_message>
<xml_diff>
--- a/deliverables/final-submission/Cloudrest_Wines_Verification_Report.docx
+++ b/deliverables/final-submission/Cloudrest_Wines_Verification_Report.docx
@@ -189,7 +189,7 @@
                 <w:rFonts w:ascii="Times New Roman" w:hAnsi="Times New Roman"/>
                 <w:sz w:val="20"/>
               </w:rPr>
-              <w:t>2026-10-08T01:15:05</w:t>
+              <w:t>2026-10-12T06:52:53</w:t>
             </w:r>
           </w:p>
         </w:tc>
@@ -631,7 +631,7 @@
                 <w:rFonts w:ascii="Times New Roman" w:hAnsi="Times New Roman"/>
                 <w:sz w:val="17"/>
               </w:rPr>
-              <w:t>{'baseTables': 55, 'views': 1, 'columns': 286, 'foreignKeys': 72, 'checkConstraints': 50, 'triggers': 30, 'routines': 3}</w:t>
+              <w:t>{'baseTables': 55, 'views': 1, 'columns': 292, 'foreignKeys': 72, 'checkConstraints': 51, 'triggers': 30, 'routines': 3}</w:t>
             </w:r>
           </w:p>
         </w:tc>
@@ -3193,7 +3193,7 @@
                 <w:rFonts w:ascii="Times New Roman" w:hAnsi="Times New Roman"/>
                 <w:sz w:val="17"/>
               </w:rPr>
-              <w:t>exit=1; expected=Order must be paid before shipment; ERROR 1644 (45000) at line 4: Order must be paid before shipment</w:t>
+              <w:t>exit=1; expected=Order must be paid before shipment; ERROR 1644 (45000) at line 6: Order must be paid before shipment</w:t>
             </w:r>
           </w:p>
         </w:tc>
@@ -3970,7 +3970,7 @@
                 <w:rFonts w:ascii="Times New Roman" w:hAnsi="Times New Roman"/>
                 <w:sz w:val="17"/>
               </w:rPr>
-              <w:t>Assessed business rule: Rule 3 current physical address</w:t>
+              <w:t>Assessed business rule: Rule 3 physical shipment destination</w:t>
             </w:r>
           </w:p>
         </w:tc>
@@ -4075,7 +4075,7 @@
                 <w:rFonts w:ascii="Times New Roman" w:hAnsi="Times New Roman"/>
                 <w:sz w:val="17"/>
               </w:rPr>
-              <w:t>t04_unpaidshipment.sql; ERROR 1644 (45000) at line 4: Order must be paid before shipment</w:t>
+              <w:t>t04_unpaidshipment.sql; ERROR 1644 (45000) at line 6: Order must be paid before shipment</w:t>
             </w:r>
           </w:p>
         </w:tc>

</xml_diff>